<commit_message>
feat: Form and export logic for Mẫu 11 Giấy triệu tập
</commit_message>
<xml_diff>
--- a/templates/TOTRINH/11_Mau_Giay_trieu_tap.docx
+++ b/templates/TOTRINH/11_Mau_Giay_trieu_tap.docx
@@ -979,220 +979,8 @@
         </w:rPr>
       </w:pPr>
       <w:r>
-        <w:rPr>
-          <w:rFonts w:ascii="Times New Roman" w:hAnsi="Times New Roman"/>
-        </w:rPr>
-        <w:tab/>
-      </w:r>
-      <w:r>
-        <w:rPr>
-          <w:rFonts w:ascii="Times New Roman" w:hAnsi="Times New Roman"/>
-          <w:b/>
-        </w:rPr>
-        <w:t xml:space="preserve">- </w:t>
-      </w:r>
-      <w:proofErr w:type="spellStart"/>
-      <w:r>
-        <w:rPr>
-          <w:rFonts w:ascii="Times New Roman" w:hAnsi="Times New Roman"/>
-          <w:b/>
-        </w:rPr>
-        <w:t>Thời</w:t>
-      </w:r>
-      <w:proofErr w:type="spellEnd"/>
-      <w:r>
-        <w:rPr>
-          <w:rFonts w:ascii="Times New Roman" w:hAnsi="Times New Roman"/>
-          <w:b/>
-        </w:rPr>
-        <w:t xml:space="preserve"> </w:t>
-      </w:r>
-      <w:proofErr w:type="spellStart"/>
-      <w:r>
-        <w:rPr>
-          <w:rFonts w:ascii="Times New Roman" w:hAnsi="Times New Roman"/>
-          <w:b/>
-        </w:rPr>
-        <w:t>gian</w:t>
-      </w:r>
-      <w:proofErr w:type="spellEnd"/>
-      <w:r>
-        <w:rPr>
-          <w:rFonts w:ascii="Times New Roman" w:hAnsi="Times New Roman"/>
-          <w:b/>
-        </w:rPr>
-        <w:t xml:space="preserve">: </w:t>
-      </w:r>
-      <w:proofErr w:type="spellStart"/>
-      <w:r>
-        <w:rPr>
-          <w:rFonts w:ascii="Times New Roman" w:hAnsi="Times New Roman"/>
-        </w:rPr>
-        <w:t>Hội</w:t>
-      </w:r>
-      <w:proofErr w:type="spellEnd"/>
-      <w:r>
-        <w:rPr>
-          <w:rFonts w:ascii="Times New Roman" w:hAnsi="Times New Roman"/>
-        </w:rPr>
-        <w:t xml:space="preserve"> </w:t>
-      </w:r>
-      <w:proofErr w:type="spellStart"/>
-      <w:r>
-        <w:rPr>
-          <w:rFonts w:ascii="Times New Roman" w:hAnsi="Times New Roman"/>
-        </w:rPr>
-        <w:t>nghị</w:t>
-      </w:r>
-      <w:proofErr w:type="spellEnd"/>
-      <w:r>
-        <w:rPr>
-          <w:rFonts w:ascii="Times New Roman" w:hAnsi="Times New Roman"/>
-        </w:rPr>
-        <w:t xml:space="preserve"> </w:t>
-      </w:r>
-      <w:proofErr w:type="spellStart"/>
-      <w:r>
-        <w:rPr>
-          <w:rFonts w:ascii="Times New Roman" w:hAnsi="Times New Roman"/>
-        </w:rPr>
-        <w:t>làm</w:t>
-      </w:r>
-      <w:proofErr w:type="spellEnd"/>
-      <w:r>
-        <w:rPr>
-          <w:rFonts w:ascii="Times New Roman" w:hAnsi="Times New Roman"/>
-        </w:rPr>
-        <w:t xml:space="preserve"> </w:t>
-      </w:r>
-      <w:proofErr w:type="spellStart"/>
-      <w:r>
-        <w:rPr>
-          <w:rFonts w:ascii="Times New Roman" w:hAnsi="Times New Roman"/>
-        </w:rPr>
-        <w:t>việc</w:t>
-      </w:r>
-      <w:proofErr w:type="spellEnd"/>
-      <w:r>
-        <w:rPr>
-          <w:rFonts w:ascii="Times New Roman" w:hAnsi="Times New Roman"/>
-        </w:rPr>
-        <w:t xml:space="preserve"> </w:t>
-      </w:r>
-      <w:proofErr w:type="spellStart"/>
-      <w:r>
-        <w:rPr>
-          <w:rFonts w:ascii="Times New Roman" w:hAnsi="Times New Roman"/>
-        </w:rPr>
-        <w:t>trong</w:t>
-      </w:r>
-      <w:proofErr w:type="spellEnd"/>
-      <w:r>
-        <w:rPr>
-          <w:rFonts w:ascii="Times New Roman" w:hAnsi="Times New Roman"/>
-        </w:rPr>
-        <w:t>…...</w:t>
-      </w:r>
-      <w:proofErr w:type="spellStart"/>
-      <w:proofErr w:type="gramStart"/>
-      <w:r>
-        <w:rPr>
-          <w:rFonts w:ascii="Times New Roman" w:hAnsi="Times New Roman"/>
-        </w:rPr>
-        <w:t>ngày</w:t>
-      </w:r>
-      <w:proofErr w:type="spellEnd"/>
-      <w:r>
-        <w:rPr>
-          <w:rFonts w:ascii="Times New Roman" w:hAnsi="Times New Roman"/>
-        </w:rPr>
-        <w:t>,…</w:t>
-      </w:r>
-      <w:proofErr w:type="gramEnd"/>
-      <w:r>
-        <w:rPr>
-          <w:rFonts w:ascii="Times New Roman" w:hAnsi="Times New Roman"/>
-        </w:rPr>
-        <w:t xml:space="preserve">./.../...200. </w:t>
-      </w:r>
-      <w:proofErr w:type="spellStart"/>
-      <w:r>
-        <w:rPr>
-          <w:rFonts w:ascii="Times New Roman" w:hAnsi="Times New Roman"/>
-        </w:rPr>
-        <w:t>đến</w:t>
-      </w:r>
-      <w:proofErr w:type="spellEnd"/>
-      <w:r>
-        <w:rPr>
-          <w:rFonts w:ascii="Times New Roman" w:hAnsi="Times New Roman"/>
-        </w:rPr>
-        <w:t xml:space="preserve"> …/…/20., </w:t>
-      </w:r>
-      <w:proofErr w:type="spellStart"/>
-      <w:r>
-        <w:rPr>
-          <w:rFonts w:ascii="Times New Roman" w:hAnsi="Times New Roman"/>
-        </w:rPr>
-        <w:t>khai</w:t>
-      </w:r>
-      <w:proofErr w:type="spellEnd"/>
-      <w:r>
-        <w:rPr>
-          <w:rFonts w:ascii="Times New Roman" w:hAnsi="Times New Roman"/>
-        </w:rPr>
-        <w:t xml:space="preserve"> </w:t>
-      </w:r>
-      <w:proofErr w:type="spellStart"/>
-      <w:r>
-        <w:rPr>
-          <w:rFonts w:ascii="Times New Roman" w:hAnsi="Times New Roman"/>
-        </w:rPr>
-        <w:t>mạc</w:t>
-      </w:r>
-      <w:proofErr w:type="spellEnd"/>
-      <w:r>
-        <w:rPr>
-          <w:rFonts w:ascii="Times New Roman" w:hAnsi="Times New Roman"/>
-        </w:rPr>
-        <w:t xml:space="preserve"> </w:t>
-      </w:r>
-      <w:proofErr w:type="spellStart"/>
-      <w:r>
-        <w:rPr>
-          <w:rFonts w:ascii="Times New Roman" w:hAnsi="Times New Roman"/>
-        </w:rPr>
-        <w:t>lúc</w:t>
-      </w:r>
-      <w:proofErr w:type="spellEnd"/>
-      <w:r>
-        <w:rPr>
-          <w:rFonts w:ascii="Times New Roman" w:hAnsi="Times New Roman"/>
-        </w:rPr>
-        <w:t xml:space="preserve">…h00 </w:t>
-      </w:r>
-      <w:proofErr w:type="spellStart"/>
-      <w:r>
-        <w:rPr>
-          <w:rFonts w:ascii="Times New Roman" w:hAnsi="Times New Roman"/>
-        </w:rPr>
-        <w:t>ngày</w:t>
-      </w:r>
-      <w:proofErr w:type="spellEnd"/>
-      <w:r>
-        <w:rPr>
-          <w:rFonts w:ascii="Times New Roman" w:hAnsi="Times New Roman"/>
-        </w:rPr>
-        <w:t>…/…/</w:t>
-      </w:r>
-      <w:proofErr w:type="gramStart"/>
-      <w:r>
-        <w:rPr>
-          <w:rFonts w:ascii="Times New Roman" w:hAnsi="Times New Roman"/>
-        </w:rPr>
-        <w:t>20..</w:t>
-      </w:r>
-      <w:proofErr w:type="gramEnd"/>
+        <w:t xml:space="preserve"> - Thời gian: (TIME)</w:t>
+      </w:r>
     </w:p>
     <w:p>
       <w:pPr>
@@ -1205,63 +993,7 @@
         </w:rPr>
       </w:pPr>
       <w:r>
-        <w:rPr>
-          <w:rFonts w:ascii="Times New Roman" w:hAnsi="Times New Roman"/>
-        </w:rPr>
-        <w:tab/>
-      </w:r>
-      <w:r>
-        <w:rPr>
-          <w:rFonts w:ascii="Times New Roman" w:hAnsi="Times New Roman"/>
-          <w:b/>
-        </w:rPr>
-        <w:t xml:space="preserve">- </w:t>
-      </w:r>
-      <w:proofErr w:type="spellStart"/>
-      <w:r>
-        <w:rPr>
-          <w:rFonts w:ascii="Times New Roman" w:hAnsi="Times New Roman"/>
-          <w:b/>
-        </w:rPr>
-        <w:t>Địa</w:t>
-      </w:r>
-      <w:proofErr w:type="spellEnd"/>
-      <w:r>
-        <w:rPr>
-          <w:rFonts w:ascii="Times New Roman" w:hAnsi="Times New Roman"/>
-          <w:b/>
-        </w:rPr>
-        <w:t xml:space="preserve"> </w:t>
-      </w:r>
-      <w:proofErr w:type="spellStart"/>
-      <w:proofErr w:type="gramStart"/>
-      <w:r>
-        <w:rPr>
-          <w:rFonts w:ascii="Times New Roman" w:hAnsi="Times New Roman"/>
-          <w:b/>
-        </w:rPr>
-        <w:t>điểm</w:t>
-      </w:r>
-      <w:proofErr w:type="spellEnd"/>
-      <w:r>
-        <w:rPr>
-          <w:rFonts w:ascii="Times New Roman" w:hAnsi="Times New Roman"/>
-          <w:b/>
-        </w:rPr>
-        <w:t>:</w:t>
-      </w:r>
-      <w:r>
-        <w:rPr>
-          <w:rFonts w:ascii="Times New Roman" w:hAnsi="Times New Roman"/>
-        </w:rPr>
-        <w:t>…</w:t>
-      </w:r>
-      <w:proofErr w:type="gramEnd"/>
-      <w:r>
-        <w:rPr>
-          <w:rFonts w:ascii="Times New Roman" w:hAnsi="Times New Roman"/>
-        </w:rPr>
-        <w:t>…………………….</w:t>
+        <w:t xml:space="preserve"> - Địa điểm: (LOCATION)</w:t>
       </w:r>
     </w:p>
     <w:p>
@@ -1378,53 +1110,7 @@
         </w:rPr>
       </w:pPr>
       <w:r>
-        <w:rPr>
-          <w:rFonts w:ascii="Times New Roman" w:hAnsi="Times New Roman"/>
-        </w:rPr>
-        <w:tab/>
-        <w:t xml:space="preserve">a. </w:t>
-      </w:r>
-      <w:proofErr w:type="spellStart"/>
-      <w:r>
-        <w:rPr>
-          <w:rFonts w:ascii="Times New Roman" w:hAnsi="Times New Roman"/>
-        </w:rPr>
-        <w:t>Khối</w:t>
-      </w:r>
-      <w:proofErr w:type="spellEnd"/>
-      <w:r>
-        <w:rPr>
-          <w:rFonts w:ascii="Times New Roman" w:hAnsi="Times New Roman"/>
-        </w:rPr>
-        <w:t xml:space="preserve"> </w:t>
-      </w:r>
-      <w:proofErr w:type="spellStart"/>
-      <w:r>
-        <w:rPr>
-          <w:rFonts w:ascii="Times New Roman" w:hAnsi="Times New Roman"/>
-        </w:rPr>
-        <w:t>cơ</w:t>
-      </w:r>
-      <w:proofErr w:type="spellEnd"/>
-      <w:r>
-        <w:rPr>
-          <w:rFonts w:ascii="Times New Roman" w:hAnsi="Times New Roman"/>
-        </w:rPr>
-        <w:t xml:space="preserve"> </w:t>
-      </w:r>
-      <w:proofErr w:type="spellStart"/>
-      <w:r>
-        <w:rPr>
-          <w:rFonts w:ascii="Times New Roman" w:hAnsi="Times New Roman"/>
-        </w:rPr>
-        <w:t>quan</w:t>
-      </w:r>
-      <w:proofErr w:type="spellEnd"/>
-      <w:r>
-        <w:rPr>
-          <w:rFonts w:ascii="Times New Roman" w:hAnsi="Times New Roman"/>
-        </w:rPr>
-        <w:t>….:</w:t>
+        <w:t xml:space="preserve"> (PARTICIPANTS)</w:t>
       </w:r>
     </w:p>
     <w:p>
@@ -1437,69 +1123,7 @@
           <w:rFonts w:ascii="Times New Roman" w:hAnsi="Times New Roman"/>
         </w:rPr>
       </w:pPr>
-      <w:r>
-        <w:rPr>
-          <w:rFonts w:ascii="Times New Roman" w:hAnsi="Times New Roman"/>
-        </w:rPr>
-        <w:tab/>
-        <w:t xml:space="preserve">b. Các </w:t>
-      </w:r>
-      <w:proofErr w:type="spellStart"/>
-      <w:r>
-        <w:rPr>
-          <w:rFonts w:ascii="Times New Roman" w:hAnsi="Times New Roman"/>
-        </w:rPr>
-        <w:t>đơn</w:t>
-      </w:r>
-      <w:proofErr w:type="spellEnd"/>
-      <w:r>
-        <w:rPr>
-          <w:rFonts w:ascii="Times New Roman" w:hAnsi="Times New Roman"/>
-        </w:rPr>
-        <w:t xml:space="preserve"> </w:t>
-      </w:r>
-      <w:proofErr w:type="spellStart"/>
-      <w:r>
-        <w:rPr>
-          <w:rFonts w:ascii="Times New Roman" w:hAnsi="Times New Roman"/>
-        </w:rPr>
-        <w:t>vị</w:t>
-      </w:r>
-      <w:proofErr w:type="spellEnd"/>
-      <w:r>
-        <w:rPr>
-          <w:rFonts w:ascii="Times New Roman" w:hAnsi="Times New Roman"/>
-        </w:rPr>
-        <w:t xml:space="preserve"> </w:t>
-      </w:r>
-      <w:proofErr w:type="spellStart"/>
-      <w:r>
-        <w:rPr>
-          <w:rFonts w:ascii="Times New Roman" w:hAnsi="Times New Roman"/>
-        </w:rPr>
-        <w:t>trực</w:t>
-      </w:r>
-      <w:proofErr w:type="spellEnd"/>
-      <w:r>
-        <w:rPr>
-          <w:rFonts w:ascii="Times New Roman" w:hAnsi="Times New Roman"/>
-        </w:rPr>
-        <w:t xml:space="preserve"> </w:t>
-      </w:r>
-      <w:proofErr w:type="spellStart"/>
-      <w:r>
-        <w:rPr>
-          <w:rFonts w:ascii="Times New Roman" w:hAnsi="Times New Roman"/>
-        </w:rPr>
-        <w:t>thuộc</w:t>
-      </w:r>
-      <w:proofErr w:type="spellEnd"/>
-      <w:r>
-        <w:rPr>
-          <w:rFonts w:ascii="Times New Roman" w:hAnsi="Times New Roman"/>
-        </w:rPr>
-        <w:t>:</w:t>
-      </w:r>
+      <w:r/>
     </w:p>
     <w:p>
       <w:pPr>
@@ -1582,287 +1206,8 @@
         </w:rPr>
       </w:pPr>
       <w:r>
-        <w:rPr>
-          <w:rFonts w:ascii="Times New Roman" w:hAnsi="Times New Roman"/>
-        </w:rPr>
-        <w:tab/>
-        <w:t xml:space="preserve">- Các </w:t>
-      </w:r>
-      <w:proofErr w:type="spellStart"/>
-      <w:r>
-        <w:rPr>
-          <w:rFonts w:ascii="Times New Roman" w:hAnsi="Times New Roman"/>
-        </w:rPr>
-        <w:t>đơn</w:t>
-      </w:r>
-      <w:proofErr w:type="spellEnd"/>
-      <w:r>
-        <w:rPr>
-          <w:rFonts w:ascii="Times New Roman" w:hAnsi="Times New Roman"/>
-        </w:rPr>
-        <w:t xml:space="preserve"> </w:t>
-      </w:r>
-      <w:proofErr w:type="spellStart"/>
-      <w:r>
-        <w:rPr>
-          <w:rFonts w:ascii="Times New Roman" w:hAnsi="Times New Roman"/>
-        </w:rPr>
-        <w:t>vị</w:t>
-      </w:r>
-      <w:proofErr w:type="spellEnd"/>
-      <w:r>
-        <w:rPr>
-          <w:rFonts w:ascii="Times New Roman" w:hAnsi="Times New Roman"/>
-        </w:rPr>
-        <w:t xml:space="preserve"> </w:t>
-      </w:r>
-      <w:proofErr w:type="spellStart"/>
-      <w:r>
-        <w:rPr>
-          <w:rFonts w:ascii="Times New Roman" w:hAnsi="Times New Roman"/>
-        </w:rPr>
-        <w:t>tham</w:t>
-      </w:r>
-      <w:proofErr w:type="spellEnd"/>
-      <w:r>
-        <w:rPr>
-          <w:rFonts w:ascii="Times New Roman" w:hAnsi="Times New Roman"/>
-        </w:rPr>
-        <w:t xml:space="preserve"> </w:t>
-      </w:r>
-      <w:proofErr w:type="spellStart"/>
-      <w:r>
-        <w:rPr>
-          <w:rFonts w:ascii="Times New Roman" w:hAnsi="Times New Roman"/>
-        </w:rPr>
-        <w:t>dự</w:t>
-      </w:r>
-      <w:proofErr w:type="spellEnd"/>
-      <w:r>
-        <w:rPr>
-          <w:rFonts w:ascii="Times New Roman" w:hAnsi="Times New Roman"/>
-        </w:rPr>
-        <w:t xml:space="preserve"> </w:t>
-      </w:r>
-      <w:proofErr w:type="spellStart"/>
-      <w:r>
-        <w:rPr>
-          <w:rFonts w:ascii="Times New Roman" w:hAnsi="Times New Roman"/>
-        </w:rPr>
-        <w:t>đủ</w:t>
-      </w:r>
-      <w:proofErr w:type="spellEnd"/>
-      <w:r>
-        <w:rPr>
-          <w:rFonts w:ascii="Times New Roman" w:hAnsi="Times New Roman"/>
-        </w:rPr>
-        <w:t xml:space="preserve">, </w:t>
-      </w:r>
-      <w:proofErr w:type="spellStart"/>
-      <w:r>
-        <w:rPr>
-          <w:rFonts w:ascii="Times New Roman" w:hAnsi="Times New Roman"/>
-        </w:rPr>
-        <w:t>đúng</w:t>
-      </w:r>
-      <w:proofErr w:type="spellEnd"/>
-      <w:r>
-        <w:rPr>
-          <w:rFonts w:ascii="Times New Roman" w:hAnsi="Times New Roman"/>
-        </w:rPr>
-        <w:t xml:space="preserve"> </w:t>
-      </w:r>
-      <w:proofErr w:type="spellStart"/>
-      <w:r>
-        <w:rPr>
-          <w:rFonts w:ascii="Times New Roman" w:hAnsi="Times New Roman"/>
-        </w:rPr>
-        <w:t>thành</w:t>
-      </w:r>
-      <w:proofErr w:type="spellEnd"/>
-      <w:r>
-        <w:rPr>
-          <w:rFonts w:ascii="Times New Roman" w:hAnsi="Times New Roman"/>
-        </w:rPr>
-        <w:t xml:space="preserve"> </w:t>
-      </w:r>
-      <w:proofErr w:type="spellStart"/>
-      <w:proofErr w:type="gramStart"/>
-      <w:r>
-        <w:rPr>
-          <w:rFonts w:ascii="Times New Roman" w:hAnsi="Times New Roman"/>
-        </w:rPr>
-        <w:t>phần</w:t>
-      </w:r>
-      <w:proofErr w:type="spellEnd"/>
-      <w:r>
-        <w:rPr>
-          <w:rFonts w:ascii="Times New Roman" w:hAnsi="Times New Roman"/>
-        </w:rPr>
-        <w:t>..</w:t>
-      </w:r>
-      <w:proofErr w:type="gramEnd"/>
-      <w:r>
-        <w:rPr>
-          <w:rFonts w:ascii="Times New Roman" w:hAnsi="Times New Roman"/>
-          <w:sz w:val="23"/>
-          <w:szCs w:val="23"/>
-        </w:rPr>
-        <w:t>(</w:t>
-      </w:r>
-      <w:proofErr w:type="spellStart"/>
-      <w:r>
-        <w:rPr>
-          <w:rFonts w:ascii="Times New Roman" w:hAnsi="Times New Roman"/>
-          <w:sz w:val="23"/>
-          <w:szCs w:val="23"/>
-        </w:rPr>
-        <w:t>nêu</w:t>
-      </w:r>
-      <w:proofErr w:type="spellEnd"/>
-      <w:r>
-        <w:rPr>
-          <w:rFonts w:ascii="Times New Roman" w:hAnsi="Times New Roman"/>
-          <w:sz w:val="23"/>
-          <w:szCs w:val="23"/>
-        </w:rPr>
-        <w:t xml:space="preserve"> </w:t>
-      </w:r>
-      <w:proofErr w:type="spellStart"/>
-      <w:r>
-        <w:rPr>
-          <w:rFonts w:ascii="Times New Roman" w:hAnsi="Times New Roman"/>
-          <w:sz w:val="23"/>
-          <w:szCs w:val="23"/>
-        </w:rPr>
-        <w:t>phương</w:t>
-      </w:r>
-      <w:proofErr w:type="spellEnd"/>
-      <w:r>
-        <w:rPr>
-          <w:rFonts w:ascii="Times New Roman" w:hAnsi="Times New Roman"/>
-          <w:sz w:val="23"/>
-          <w:szCs w:val="23"/>
-        </w:rPr>
-        <w:t xml:space="preserve"> </w:t>
-      </w:r>
-      <w:proofErr w:type="spellStart"/>
-      <w:r>
-        <w:rPr>
-          <w:rFonts w:ascii="Times New Roman" w:hAnsi="Times New Roman"/>
-          <w:sz w:val="23"/>
-          <w:szCs w:val="23"/>
-        </w:rPr>
-        <w:t>tiện</w:t>
-      </w:r>
-      <w:proofErr w:type="spellEnd"/>
-      <w:r>
-        <w:rPr>
-          <w:rFonts w:ascii="Times New Roman" w:hAnsi="Times New Roman"/>
-          <w:sz w:val="23"/>
-          <w:szCs w:val="23"/>
-        </w:rPr>
-        <w:t xml:space="preserve"> </w:t>
-      </w:r>
-      <w:proofErr w:type="spellStart"/>
-      <w:r>
-        <w:rPr>
-          <w:rFonts w:ascii="Times New Roman" w:hAnsi="Times New Roman"/>
-          <w:sz w:val="23"/>
-          <w:szCs w:val="23"/>
-        </w:rPr>
-        <w:t>đi</w:t>
-      </w:r>
-      <w:proofErr w:type="spellEnd"/>
-      <w:r>
-        <w:rPr>
-          <w:rFonts w:ascii="Times New Roman" w:hAnsi="Times New Roman"/>
-          <w:sz w:val="23"/>
-          <w:szCs w:val="23"/>
-        </w:rPr>
-        <w:t xml:space="preserve"> </w:t>
-      </w:r>
-      <w:proofErr w:type="spellStart"/>
-      <w:r>
-        <w:rPr>
-          <w:rFonts w:ascii="Times New Roman" w:hAnsi="Times New Roman"/>
-          <w:sz w:val="23"/>
-          <w:szCs w:val="23"/>
-        </w:rPr>
-        <w:t>lại</w:t>
-      </w:r>
-      <w:proofErr w:type="spellEnd"/>
-      <w:r>
-        <w:rPr>
-          <w:rFonts w:ascii="Times New Roman" w:hAnsi="Times New Roman"/>
-          <w:sz w:val="23"/>
-          <w:szCs w:val="23"/>
-        </w:rPr>
-        <w:t xml:space="preserve"> </w:t>
-      </w:r>
-      <w:proofErr w:type="spellStart"/>
-      <w:r>
-        <w:rPr>
-          <w:rFonts w:ascii="Times New Roman" w:hAnsi="Times New Roman"/>
-          <w:sz w:val="23"/>
-          <w:szCs w:val="23"/>
-        </w:rPr>
-        <w:t>của</w:t>
-      </w:r>
-      <w:proofErr w:type="spellEnd"/>
-      <w:r>
-        <w:rPr>
-          <w:rFonts w:ascii="Times New Roman" w:hAnsi="Times New Roman"/>
-          <w:sz w:val="23"/>
-          <w:szCs w:val="23"/>
-        </w:rPr>
-        <w:t xml:space="preserve"> </w:t>
-      </w:r>
-      <w:proofErr w:type="spellStart"/>
-      <w:r>
-        <w:rPr>
-          <w:rFonts w:ascii="Times New Roman" w:hAnsi="Times New Roman"/>
-          <w:sz w:val="23"/>
-          <w:szCs w:val="23"/>
-        </w:rPr>
-        <w:t>đại</w:t>
-      </w:r>
-      <w:proofErr w:type="spellEnd"/>
-      <w:r>
-        <w:rPr>
-          <w:rFonts w:ascii="Times New Roman" w:hAnsi="Times New Roman"/>
-          <w:sz w:val="23"/>
-          <w:szCs w:val="23"/>
-        </w:rPr>
-        <w:t xml:space="preserve"> </w:t>
-      </w:r>
-      <w:proofErr w:type="spellStart"/>
-      <w:proofErr w:type="gramStart"/>
-      <w:r>
-        <w:rPr>
-          <w:rFonts w:ascii="Times New Roman" w:hAnsi="Times New Roman"/>
-          <w:sz w:val="23"/>
-          <w:szCs w:val="23"/>
-        </w:rPr>
-        <w:t>biểu</w:t>
-      </w:r>
-      <w:proofErr w:type="spellEnd"/>
-      <w:r>
-        <w:rPr>
-          <w:rFonts w:ascii="Times New Roman" w:hAnsi="Times New Roman"/>
-          <w:sz w:val="23"/>
-          <w:szCs w:val="23"/>
-        </w:rPr>
-        <w:t>)</w:t>
-      </w:r>
-      <w:r>
-        <w:rPr>
-          <w:rFonts w:ascii="Times New Roman" w:hAnsi="Times New Roman"/>
-          <w:sz w:val="20"/>
-        </w:rPr>
-        <w:t>…</w:t>
-      </w:r>
-      <w:proofErr w:type="gramEnd"/>
+        <w:t xml:space="preserve"> (ORGANIZATION)</w:t>
+      </w:r>
     </w:p>
     <w:p>
       <w:pPr>
@@ -1874,363 +1219,7 @@
           <w:rFonts w:ascii="Times New Roman" w:hAnsi="Times New Roman"/>
         </w:rPr>
       </w:pPr>
-      <w:r>
-        <w:rPr>
-          <w:rFonts w:ascii="Times New Roman" w:hAnsi="Times New Roman"/>
-        </w:rPr>
-        <w:tab/>
-        <w:t xml:space="preserve">- Ban </w:t>
-      </w:r>
-      <w:proofErr w:type="spellStart"/>
-      <w:r>
-        <w:rPr>
-          <w:rFonts w:ascii="Times New Roman" w:hAnsi="Times New Roman"/>
-        </w:rPr>
-        <w:t>tổ</w:t>
-      </w:r>
-      <w:proofErr w:type="spellEnd"/>
-      <w:r>
-        <w:rPr>
-          <w:rFonts w:ascii="Times New Roman" w:hAnsi="Times New Roman"/>
-        </w:rPr>
-        <w:t xml:space="preserve"> </w:t>
-      </w:r>
-      <w:proofErr w:type="spellStart"/>
-      <w:r>
-        <w:rPr>
-          <w:rFonts w:ascii="Times New Roman" w:hAnsi="Times New Roman"/>
-        </w:rPr>
-        <w:t>chức</w:t>
-      </w:r>
-      <w:proofErr w:type="spellEnd"/>
-      <w:r>
-        <w:rPr>
-          <w:rFonts w:ascii="Times New Roman" w:hAnsi="Times New Roman"/>
-        </w:rPr>
-        <w:t xml:space="preserve"> </w:t>
-      </w:r>
-      <w:proofErr w:type="spellStart"/>
-      <w:r>
-        <w:rPr>
-          <w:rFonts w:ascii="Times New Roman" w:hAnsi="Times New Roman"/>
-        </w:rPr>
-        <w:t>Hội</w:t>
-      </w:r>
-      <w:proofErr w:type="spellEnd"/>
-      <w:r>
-        <w:rPr>
-          <w:rFonts w:ascii="Times New Roman" w:hAnsi="Times New Roman"/>
-        </w:rPr>
-        <w:t xml:space="preserve"> </w:t>
-      </w:r>
-      <w:proofErr w:type="spellStart"/>
-      <w:r>
-        <w:rPr>
-          <w:rFonts w:ascii="Times New Roman" w:hAnsi="Times New Roman"/>
-        </w:rPr>
-        <w:t>nghị</w:t>
-      </w:r>
-      <w:proofErr w:type="spellEnd"/>
-      <w:r>
-        <w:rPr>
-          <w:rFonts w:ascii="Times New Roman" w:hAnsi="Times New Roman"/>
-        </w:rPr>
-        <w:t xml:space="preserve"> </w:t>
-      </w:r>
-      <w:proofErr w:type="spellStart"/>
-      <w:r>
-        <w:rPr>
-          <w:rFonts w:ascii="Times New Roman" w:hAnsi="Times New Roman"/>
-        </w:rPr>
-        <w:t>đón</w:t>
-      </w:r>
-      <w:proofErr w:type="spellEnd"/>
-      <w:r>
-        <w:rPr>
-          <w:rFonts w:ascii="Times New Roman" w:hAnsi="Times New Roman"/>
-        </w:rPr>
-        <w:t xml:space="preserve"> </w:t>
-      </w:r>
-      <w:proofErr w:type="spellStart"/>
-      <w:r>
-        <w:rPr>
-          <w:rFonts w:ascii="Times New Roman" w:hAnsi="Times New Roman"/>
-        </w:rPr>
-        <w:t>tiếp</w:t>
-      </w:r>
-      <w:proofErr w:type="spellEnd"/>
-      <w:r>
-        <w:rPr>
-          <w:rFonts w:ascii="Times New Roman" w:hAnsi="Times New Roman"/>
-        </w:rPr>
-        <w:t xml:space="preserve"> </w:t>
-      </w:r>
-      <w:proofErr w:type="spellStart"/>
-      <w:r>
-        <w:rPr>
-          <w:rFonts w:ascii="Times New Roman" w:hAnsi="Times New Roman"/>
-        </w:rPr>
-        <w:t>và</w:t>
-      </w:r>
-      <w:proofErr w:type="spellEnd"/>
-      <w:r>
-        <w:rPr>
-          <w:rFonts w:ascii="Times New Roman" w:hAnsi="Times New Roman"/>
-        </w:rPr>
-        <w:t xml:space="preserve"> </w:t>
-      </w:r>
-      <w:proofErr w:type="spellStart"/>
-      <w:r>
-        <w:rPr>
-          <w:rFonts w:ascii="Times New Roman" w:hAnsi="Times New Roman"/>
-        </w:rPr>
-        <w:t>phát</w:t>
-      </w:r>
-      <w:proofErr w:type="spellEnd"/>
-      <w:r>
-        <w:rPr>
-          <w:rFonts w:ascii="Times New Roman" w:hAnsi="Times New Roman"/>
-        </w:rPr>
-        <w:t xml:space="preserve"> </w:t>
-      </w:r>
-      <w:proofErr w:type="spellStart"/>
-      <w:r>
-        <w:rPr>
-          <w:rFonts w:ascii="Times New Roman" w:hAnsi="Times New Roman"/>
-        </w:rPr>
-        <w:t>tài</w:t>
-      </w:r>
-      <w:proofErr w:type="spellEnd"/>
-      <w:r>
-        <w:rPr>
-          <w:rFonts w:ascii="Times New Roman" w:hAnsi="Times New Roman"/>
-        </w:rPr>
-        <w:t xml:space="preserve"> </w:t>
-      </w:r>
-      <w:proofErr w:type="spellStart"/>
-      <w:r>
-        <w:rPr>
-          <w:rFonts w:ascii="Times New Roman" w:hAnsi="Times New Roman"/>
-        </w:rPr>
-        <w:t>liệu</w:t>
-      </w:r>
-      <w:proofErr w:type="spellEnd"/>
-      <w:r>
-        <w:rPr>
-          <w:rFonts w:ascii="Times New Roman" w:hAnsi="Times New Roman"/>
-        </w:rPr>
-        <w:t xml:space="preserve"> </w:t>
-      </w:r>
-      <w:proofErr w:type="spellStart"/>
-      <w:r>
-        <w:rPr>
-          <w:rFonts w:ascii="Times New Roman" w:hAnsi="Times New Roman"/>
-        </w:rPr>
-        <w:t>tới</w:t>
-      </w:r>
-      <w:proofErr w:type="spellEnd"/>
-      <w:r>
-        <w:rPr>
-          <w:rFonts w:ascii="Times New Roman" w:hAnsi="Times New Roman"/>
-        </w:rPr>
-        <w:t xml:space="preserve"> </w:t>
-      </w:r>
-      <w:proofErr w:type="spellStart"/>
-      <w:r>
-        <w:rPr>
-          <w:rFonts w:ascii="Times New Roman" w:hAnsi="Times New Roman"/>
-        </w:rPr>
-        <w:t>các</w:t>
-      </w:r>
-      <w:proofErr w:type="spellEnd"/>
-      <w:r>
-        <w:rPr>
-          <w:rFonts w:ascii="Times New Roman" w:hAnsi="Times New Roman"/>
-        </w:rPr>
-        <w:t xml:space="preserve"> </w:t>
-      </w:r>
-      <w:proofErr w:type="spellStart"/>
-      <w:r>
-        <w:rPr>
-          <w:rFonts w:ascii="Times New Roman" w:hAnsi="Times New Roman"/>
-        </w:rPr>
-        <w:t>đại</w:t>
-      </w:r>
-      <w:proofErr w:type="spellEnd"/>
-      <w:r>
-        <w:rPr>
-          <w:rFonts w:ascii="Times New Roman" w:hAnsi="Times New Roman"/>
-        </w:rPr>
-        <w:t xml:space="preserve"> </w:t>
-      </w:r>
-      <w:proofErr w:type="spellStart"/>
-      <w:r>
-        <w:rPr>
-          <w:rFonts w:ascii="Times New Roman" w:hAnsi="Times New Roman"/>
-        </w:rPr>
-        <w:t>biểu</w:t>
-      </w:r>
-      <w:proofErr w:type="spellEnd"/>
-      <w:r>
-        <w:rPr>
-          <w:rFonts w:ascii="Times New Roman" w:hAnsi="Times New Roman"/>
-        </w:rPr>
-        <w:t xml:space="preserve">, </w:t>
-      </w:r>
-      <w:proofErr w:type="spellStart"/>
-      <w:r>
-        <w:rPr>
-          <w:rFonts w:ascii="Times New Roman" w:hAnsi="Times New Roman"/>
-        </w:rPr>
-        <w:t>bắt</w:t>
-      </w:r>
-      <w:proofErr w:type="spellEnd"/>
-      <w:r>
-        <w:rPr>
-          <w:rFonts w:ascii="Times New Roman" w:hAnsi="Times New Roman"/>
-        </w:rPr>
-        <w:t xml:space="preserve"> </w:t>
-      </w:r>
-      <w:proofErr w:type="spellStart"/>
-      <w:r>
-        <w:rPr>
-          <w:rFonts w:ascii="Times New Roman" w:hAnsi="Times New Roman"/>
-        </w:rPr>
-        <w:t>đầu</w:t>
-      </w:r>
-      <w:proofErr w:type="spellEnd"/>
-      <w:r>
-        <w:rPr>
-          <w:rFonts w:ascii="Times New Roman" w:hAnsi="Times New Roman"/>
-        </w:rPr>
-        <w:t xml:space="preserve"> </w:t>
-      </w:r>
-      <w:proofErr w:type="spellStart"/>
-      <w:r>
-        <w:rPr>
-          <w:rFonts w:ascii="Times New Roman" w:hAnsi="Times New Roman"/>
-        </w:rPr>
-        <w:t>từ</w:t>
-      </w:r>
-      <w:proofErr w:type="spellEnd"/>
-      <w:r>
-        <w:rPr>
-          <w:rFonts w:ascii="Times New Roman" w:hAnsi="Times New Roman"/>
-        </w:rPr>
-        <w:t xml:space="preserve">…h00, </w:t>
-      </w:r>
-      <w:proofErr w:type="spellStart"/>
-      <w:r>
-        <w:rPr>
-          <w:rFonts w:ascii="Times New Roman" w:hAnsi="Times New Roman"/>
-        </w:rPr>
-        <w:t>ngày</w:t>
-      </w:r>
-      <w:proofErr w:type="spellEnd"/>
-      <w:r>
-        <w:rPr>
-          <w:rFonts w:ascii="Times New Roman" w:hAnsi="Times New Roman"/>
-        </w:rPr>
-        <w:t xml:space="preserve">…/…/200. </w:t>
-      </w:r>
-      <w:proofErr w:type="spellStart"/>
-      <w:r>
-        <w:rPr>
-          <w:rFonts w:ascii="Times New Roman" w:hAnsi="Times New Roman"/>
-        </w:rPr>
-        <w:t>tại</w:t>
-      </w:r>
-      <w:proofErr w:type="spellEnd"/>
-      <w:r>
-        <w:rPr>
-          <w:rFonts w:ascii="Times New Roman" w:hAnsi="Times New Roman"/>
-        </w:rPr>
-        <w:t>………</w:t>
-      </w:r>
-      <w:proofErr w:type="gramStart"/>
-      <w:r>
-        <w:rPr>
-          <w:rFonts w:ascii="Times New Roman" w:hAnsi="Times New Roman"/>
-        </w:rPr>
-        <w:t>…..</w:t>
-      </w:r>
-      <w:proofErr w:type="gramEnd"/>
-      <w:r>
-        <w:rPr>
-          <w:rFonts w:ascii="Times New Roman" w:hAnsi="Times New Roman"/>
-        </w:rPr>
-        <w:t>(</w:t>
-      </w:r>
-      <w:proofErr w:type="spellStart"/>
-      <w:r>
-        <w:rPr>
-          <w:rFonts w:ascii="Times New Roman" w:hAnsi="Times New Roman"/>
-        </w:rPr>
-        <w:t>điện</w:t>
-      </w:r>
-      <w:proofErr w:type="spellEnd"/>
-      <w:r>
-        <w:rPr>
-          <w:rFonts w:ascii="Times New Roman" w:hAnsi="Times New Roman"/>
-        </w:rPr>
-        <w:t xml:space="preserve"> </w:t>
-      </w:r>
-      <w:proofErr w:type="spellStart"/>
-      <w:r>
-        <w:rPr>
-          <w:rFonts w:ascii="Times New Roman" w:hAnsi="Times New Roman"/>
-        </w:rPr>
-        <w:t>thoại</w:t>
-      </w:r>
-      <w:proofErr w:type="spellEnd"/>
-      <w:r>
-        <w:rPr>
-          <w:rFonts w:ascii="Times New Roman" w:hAnsi="Times New Roman"/>
-        </w:rPr>
-        <w:t xml:space="preserve"> </w:t>
-      </w:r>
-      <w:proofErr w:type="spellStart"/>
-      <w:r>
-        <w:rPr>
-          <w:rFonts w:ascii="Times New Roman" w:hAnsi="Times New Roman"/>
-        </w:rPr>
-        <w:t>liên</w:t>
-      </w:r>
-      <w:proofErr w:type="spellEnd"/>
-      <w:r>
-        <w:rPr>
-          <w:rFonts w:ascii="Times New Roman" w:hAnsi="Times New Roman"/>
-        </w:rPr>
-        <w:t xml:space="preserve"> </w:t>
-      </w:r>
-      <w:proofErr w:type="spellStart"/>
-      <w:r>
-        <w:rPr>
-          <w:rFonts w:ascii="Times New Roman" w:hAnsi="Times New Roman"/>
-        </w:rPr>
-        <w:t>hệ</w:t>
-      </w:r>
-      <w:proofErr w:type="spellEnd"/>
-      <w:r>
-        <w:rPr>
-          <w:rFonts w:ascii="Times New Roman" w:hAnsi="Times New Roman"/>
-        </w:rPr>
-        <w:t>……………</w:t>
-      </w:r>
-      <w:proofErr w:type="gramStart"/>
-      <w:r>
-        <w:rPr>
-          <w:rFonts w:ascii="Times New Roman" w:hAnsi="Times New Roman"/>
-        </w:rPr>
-        <w:t>…..</w:t>
-      </w:r>
-      <w:proofErr w:type="gramEnd"/>
-      <w:r>
-        <w:rPr>
-          <w:rFonts w:ascii="Times New Roman" w:hAnsi="Times New Roman"/>
-        </w:rPr>
-        <w:t>).</w:t>
-      </w:r>
+      <w:r/>
     </w:p>
     <w:p>
       <w:pPr>
@@ -2243,470 +1232,7 @@
           <w:szCs w:val="28"/>
         </w:rPr>
       </w:pPr>
-      <w:r>
-        <w:rPr>
-          <w:rFonts w:ascii="Times New Roman" w:hAnsi="Times New Roman"/>
-          <w:sz w:val="24"/>
-        </w:rPr>
-        <w:tab/>
-      </w:r>
-      <w:r>
-        <w:rPr>
-          <w:rFonts w:ascii="Times New Roman" w:hAnsi="Times New Roman"/>
-          <w:szCs w:val="28"/>
-        </w:rPr>
-        <w:t xml:space="preserve">- Trong </w:t>
-      </w:r>
-      <w:proofErr w:type="spellStart"/>
-      <w:r>
-        <w:rPr>
-          <w:rFonts w:ascii="Times New Roman" w:hAnsi="Times New Roman"/>
-          <w:szCs w:val="28"/>
-        </w:rPr>
-        <w:t>quá</w:t>
-      </w:r>
-      <w:proofErr w:type="spellEnd"/>
-      <w:r>
-        <w:rPr>
-          <w:rFonts w:ascii="Times New Roman" w:hAnsi="Times New Roman"/>
-          <w:szCs w:val="28"/>
-        </w:rPr>
-        <w:t xml:space="preserve"> </w:t>
-      </w:r>
-      <w:proofErr w:type="spellStart"/>
-      <w:r>
-        <w:rPr>
-          <w:rFonts w:ascii="Times New Roman" w:hAnsi="Times New Roman"/>
-          <w:szCs w:val="28"/>
-        </w:rPr>
-        <w:t>trình</w:t>
-      </w:r>
-      <w:proofErr w:type="spellEnd"/>
-      <w:r>
-        <w:rPr>
-          <w:rFonts w:ascii="Times New Roman" w:hAnsi="Times New Roman"/>
-          <w:szCs w:val="28"/>
-        </w:rPr>
-        <w:t xml:space="preserve"> </w:t>
-      </w:r>
-      <w:proofErr w:type="spellStart"/>
-      <w:r>
-        <w:rPr>
-          <w:rFonts w:ascii="Times New Roman" w:hAnsi="Times New Roman"/>
-          <w:szCs w:val="28"/>
-        </w:rPr>
-        <w:t>triển</w:t>
-      </w:r>
-      <w:proofErr w:type="spellEnd"/>
-      <w:r>
-        <w:rPr>
-          <w:rFonts w:ascii="Times New Roman" w:hAnsi="Times New Roman"/>
-          <w:szCs w:val="28"/>
-        </w:rPr>
-        <w:t xml:space="preserve"> </w:t>
-      </w:r>
-      <w:proofErr w:type="spellStart"/>
-      <w:r>
-        <w:rPr>
-          <w:rFonts w:ascii="Times New Roman" w:hAnsi="Times New Roman"/>
-          <w:szCs w:val="28"/>
-        </w:rPr>
-        <w:t>khai</w:t>
-      </w:r>
-      <w:proofErr w:type="spellEnd"/>
-      <w:r>
-        <w:rPr>
-          <w:rFonts w:ascii="Times New Roman" w:hAnsi="Times New Roman"/>
-          <w:szCs w:val="28"/>
-        </w:rPr>
-        <w:t xml:space="preserve">, </w:t>
-      </w:r>
-      <w:proofErr w:type="spellStart"/>
-      <w:r>
-        <w:rPr>
-          <w:rFonts w:ascii="Times New Roman" w:hAnsi="Times New Roman"/>
-          <w:szCs w:val="28"/>
-        </w:rPr>
-        <w:t>nếu</w:t>
-      </w:r>
-      <w:proofErr w:type="spellEnd"/>
-      <w:r>
-        <w:rPr>
-          <w:rFonts w:ascii="Times New Roman" w:hAnsi="Times New Roman"/>
-          <w:szCs w:val="28"/>
-        </w:rPr>
-        <w:t xml:space="preserve"> </w:t>
-      </w:r>
-      <w:proofErr w:type="spellStart"/>
-      <w:r>
-        <w:rPr>
-          <w:rFonts w:ascii="Times New Roman" w:hAnsi="Times New Roman"/>
-          <w:szCs w:val="28"/>
-        </w:rPr>
-        <w:t>có</w:t>
-      </w:r>
-      <w:proofErr w:type="spellEnd"/>
-      <w:r>
-        <w:rPr>
-          <w:rFonts w:ascii="Times New Roman" w:hAnsi="Times New Roman"/>
-          <w:szCs w:val="28"/>
-        </w:rPr>
-        <w:t xml:space="preserve"> </w:t>
-      </w:r>
-      <w:proofErr w:type="spellStart"/>
-      <w:r>
-        <w:rPr>
-          <w:rFonts w:ascii="Times New Roman" w:hAnsi="Times New Roman"/>
-          <w:szCs w:val="28"/>
-        </w:rPr>
-        <w:t>vướng</w:t>
-      </w:r>
-      <w:proofErr w:type="spellEnd"/>
-      <w:r>
-        <w:rPr>
-          <w:rFonts w:ascii="Times New Roman" w:hAnsi="Times New Roman"/>
-          <w:szCs w:val="28"/>
-        </w:rPr>
-        <w:t xml:space="preserve"> </w:t>
-      </w:r>
-      <w:proofErr w:type="spellStart"/>
-      <w:r>
-        <w:rPr>
-          <w:rFonts w:ascii="Times New Roman" w:hAnsi="Times New Roman"/>
-          <w:szCs w:val="28"/>
-        </w:rPr>
-        <w:t>mắc</w:t>
-      </w:r>
-      <w:proofErr w:type="spellEnd"/>
-      <w:r>
-        <w:rPr>
-          <w:rFonts w:ascii="Times New Roman" w:hAnsi="Times New Roman"/>
-          <w:szCs w:val="28"/>
-        </w:rPr>
-        <w:t xml:space="preserve"> </w:t>
-      </w:r>
-      <w:proofErr w:type="spellStart"/>
-      <w:r>
-        <w:rPr>
-          <w:rFonts w:ascii="Times New Roman" w:hAnsi="Times New Roman"/>
-          <w:szCs w:val="28"/>
-        </w:rPr>
-        <w:t>phát</w:t>
-      </w:r>
-      <w:proofErr w:type="spellEnd"/>
-      <w:r>
-        <w:rPr>
-          <w:rFonts w:ascii="Times New Roman" w:hAnsi="Times New Roman"/>
-          <w:szCs w:val="28"/>
-        </w:rPr>
-        <w:t xml:space="preserve"> </w:t>
-      </w:r>
-      <w:proofErr w:type="spellStart"/>
-      <w:r>
-        <w:rPr>
-          <w:rFonts w:ascii="Times New Roman" w:hAnsi="Times New Roman"/>
-          <w:szCs w:val="28"/>
-        </w:rPr>
-        <w:t>sinh</w:t>
-      </w:r>
-      <w:proofErr w:type="spellEnd"/>
-      <w:r>
-        <w:rPr>
-          <w:rFonts w:ascii="Times New Roman" w:hAnsi="Times New Roman"/>
-          <w:szCs w:val="28"/>
-        </w:rPr>
-        <w:t xml:space="preserve">, </w:t>
-      </w:r>
-      <w:proofErr w:type="spellStart"/>
-      <w:r>
-        <w:rPr>
-          <w:rFonts w:ascii="Times New Roman" w:hAnsi="Times New Roman"/>
-          <w:szCs w:val="28"/>
-        </w:rPr>
-        <w:t>đề</w:t>
-      </w:r>
-      <w:proofErr w:type="spellEnd"/>
-      <w:r>
-        <w:rPr>
-          <w:rFonts w:ascii="Times New Roman" w:hAnsi="Times New Roman"/>
-          <w:szCs w:val="28"/>
-        </w:rPr>
-        <w:t xml:space="preserve"> </w:t>
-      </w:r>
-      <w:proofErr w:type="spellStart"/>
-      <w:r>
-        <w:rPr>
-          <w:rFonts w:ascii="Times New Roman" w:hAnsi="Times New Roman"/>
-          <w:szCs w:val="28"/>
-        </w:rPr>
-        <w:t>nghị</w:t>
-      </w:r>
-      <w:proofErr w:type="spellEnd"/>
-      <w:r>
-        <w:rPr>
-          <w:rFonts w:ascii="Times New Roman" w:hAnsi="Times New Roman"/>
-          <w:szCs w:val="28"/>
-        </w:rPr>
-        <w:t xml:space="preserve"> </w:t>
-      </w:r>
-      <w:proofErr w:type="spellStart"/>
-      <w:r>
-        <w:rPr>
-          <w:rFonts w:ascii="Times New Roman" w:hAnsi="Times New Roman"/>
-          <w:szCs w:val="28"/>
-        </w:rPr>
-        <w:t>liên</w:t>
-      </w:r>
-      <w:proofErr w:type="spellEnd"/>
-      <w:r>
-        <w:rPr>
-          <w:rFonts w:ascii="Times New Roman" w:hAnsi="Times New Roman"/>
-          <w:szCs w:val="28"/>
-        </w:rPr>
-        <w:t xml:space="preserve"> </w:t>
-      </w:r>
-      <w:proofErr w:type="spellStart"/>
-      <w:r>
-        <w:rPr>
-          <w:rFonts w:ascii="Times New Roman" w:hAnsi="Times New Roman"/>
-          <w:szCs w:val="28"/>
-        </w:rPr>
-        <w:t>hệ</w:t>
-      </w:r>
-      <w:proofErr w:type="spellEnd"/>
-      <w:r>
-        <w:rPr>
-          <w:rFonts w:ascii="Times New Roman" w:hAnsi="Times New Roman"/>
-          <w:szCs w:val="28"/>
-        </w:rPr>
-        <w:t xml:space="preserve"> </w:t>
-      </w:r>
-      <w:proofErr w:type="spellStart"/>
-      <w:r>
-        <w:rPr>
-          <w:rFonts w:ascii="Times New Roman" w:hAnsi="Times New Roman"/>
-          <w:szCs w:val="28"/>
-        </w:rPr>
-        <w:t>với</w:t>
-      </w:r>
-      <w:proofErr w:type="spellEnd"/>
-      <w:r>
-        <w:rPr>
-          <w:rFonts w:ascii="Times New Roman" w:hAnsi="Times New Roman"/>
-          <w:szCs w:val="28"/>
-        </w:rPr>
-        <w:t xml:space="preserve"> Ban </w:t>
-      </w:r>
-      <w:proofErr w:type="spellStart"/>
-      <w:r>
-        <w:rPr>
-          <w:rFonts w:ascii="Times New Roman" w:hAnsi="Times New Roman"/>
-          <w:szCs w:val="28"/>
-        </w:rPr>
-        <w:t>tổ</w:t>
-      </w:r>
-      <w:proofErr w:type="spellEnd"/>
-      <w:r>
-        <w:rPr>
-          <w:rFonts w:ascii="Times New Roman" w:hAnsi="Times New Roman"/>
-          <w:szCs w:val="28"/>
-        </w:rPr>
-        <w:t xml:space="preserve"> </w:t>
-      </w:r>
-      <w:proofErr w:type="spellStart"/>
-      <w:r>
-        <w:rPr>
-          <w:rFonts w:ascii="Times New Roman" w:hAnsi="Times New Roman"/>
-          <w:szCs w:val="28"/>
-        </w:rPr>
-        <w:t>chức</w:t>
-      </w:r>
-      <w:proofErr w:type="spellEnd"/>
-      <w:r>
-        <w:rPr>
-          <w:rFonts w:ascii="Times New Roman" w:hAnsi="Times New Roman"/>
-          <w:szCs w:val="28"/>
-        </w:rPr>
-        <w:t xml:space="preserve"> </w:t>
-      </w:r>
-      <w:proofErr w:type="spellStart"/>
-      <w:r>
-        <w:rPr>
-          <w:rFonts w:ascii="Times New Roman" w:hAnsi="Times New Roman"/>
-          <w:szCs w:val="28"/>
-        </w:rPr>
-        <w:t>Hội</w:t>
-      </w:r>
-      <w:proofErr w:type="spellEnd"/>
-      <w:r>
-        <w:rPr>
-          <w:rFonts w:ascii="Times New Roman" w:hAnsi="Times New Roman"/>
-          <w:szCs w:val="28"/>
-        </w:rPr>
-        <w:t xml:space="preserve"> </w:t>
-      </w:r>
-      <w:proofErr w:type="spellStart"/>
-      <w:r>
-        <w:rPr>
-          <w:rFonts w:ascii="Times New Roman" w:hAnsi="Times New Roman"/>
-          <w:szCs w:val="28"/>
-        </w:rPr>
-        <w:t>nghị</w:t>
-      </w:r>
-      <w:proofErr w:type="spellEnd"/>
-      <w:r>
-        <w:rPr>
-          <w:rFonts w:ascii="Times New Roman" w:hAnsi="Times New Roman"/>
-          <w:szCs w:val="28"/>
-        </w:rPr>
-        <w:t xml:space="preserve">, </w:t>
-      </w:r>
-      <w:proofErr w:type="spellStart"/>
-      <w:r>
-        <w:rPr>
-          <w:rFonts w:ascii="Times New Roman" w:hAnsi="Times New Roman"/>
-          <w:szCs w:val="28"/>
-        </w:rPr>
-        <w:t>số</w:t>
-      </w:r>
-      <w:proofErr w:type="spellEnd"/>
-      <w:r>
-        <w:rPr>
-          <w:rFonts w:ascii="Times New Roman" w:hAnsi="Times New Roman"/>
-          <w:szCs w:val="28"/>
-        </w:rPr>
-        <w:t xml:space="preserve"> </w:t>
-      </w:r>
-      <w:proofErr w:type="spellStart"/>
-      <w:r>
-        <w:rPr>
-          <w:rFonts w:ascii="Times New Roman" w:hAnsi="Times New Roman"/>
-          <w:szCs w:val="28"/>
-        </w:rPr>
-        <w:t>điện</w:t>
-      </w:r>
-      <w:proofErr w:type="spellEnd"/>
-      <w:r>
-        <w:rPr>
-          <w:rFonts w:ascii="Times New Roman" w:hAnsi="Times New Roman"/>
-          <w:szCs w:val="28"/>
-        </w:rPr>
-        <w:t xml:space="preserve"> </w:t>
-      </w:r>
-      <w:proofErr w:type="spellStart"/>
-      <w:proofErr w:type="gramStart"/>
-      <w:r>
-        <w:rPr>
-          <w:rFonts w:ascii="Times New Roman" w:hAnsi="Times New Roman"/>
-          <w:szCs w:val="28"/>
-        </w:rPr>
-        <w:t>thoại</w:t>
-      </w:r>
-      <w:proofErr w:type="spellEnd"/>
-      <w:r>
-        <w:rPr>
-          <w:rFonts w:ascii="Times New Roman" w:hAnsi="Times New Roman"/>
-          <w:szCs w:val="28"/>
-        </w:rPr>
-        <w:t>:…</w:t>
-      </w:r>
-      <w:proofErr w:type="gramEnd"/>
-      <w:r>
-        <w:rPr>
-          <w:rFonts w:ascii="Times New Roman" w:hAnsi="Times New Roman"/>
-          <w:szCs w:val="28"/>
-        </w:rPr>
-        <w:t>……………</w:t>
-      </w:r>
-      <w:proofErr w:type="gramStart"/>
-      <w:r>
-        <w:rPr>
-          <w:rFonts w:ascii="Times New Roman" w:hAnsi="Times New Roman"/>
-          <w:szCs w:val="28"/>
-        </w:rPr>
-        <w:t>….</w:t>
-      </w:r>
-      <w:proofErr w:type="spellStart"/>
-      <w:r>
-        <w:rPr>
-          <w:rFonts w:ascii="Times New Roman" w:hAnsi="Times New Roman"/>
-          <w:szCs w:val="28"/>
-        </w:rPr>
-        <w:t>để</w:t>
-      </w:r>
-      <w:proofErr w:type="spellEnd"/>
-      <w:proofErr w:type="gramEnd"/>
-      <w:r>
-        <w:rPr>
-          <w:rFonts w:ascii="Times New Roman" w:hAnsi="Times New Roman"/>
-          <w:szCs w:val="28"/>
-        </w:rPr>
-        <w:t xml:space="preserve"> </w:t>
-      </w:r>
-      <w:proofErr w:type="spellStart"/>
-      <w:r>
-        <w:rPr>
-          <w:rFonts w:ascii="Times New Roman" w:hAnsi="Times New Roman"/>
-          <w:szCs w:val="28"/>
-        </w:rPr>
-        <w:t>phối</w:t>
-      </w:r>
-      <w:proofErr w:type="spellEnd"/>
-      <w:r>
-        <w:rPr>
-          <w:rFonts w:ascii="Times New Roman" w:hAnsi="Times New Roman"/>
-          <w:szCs w:val="28"/>
-        </w:rPr>
-        <w:t xml:space="preserve"> </w:t>
-      </w:r>
-      <w:proofErr w:type="spellStart"/>
-      <w:r>
-        <w:rPr>
-          <w:rFonts w:ascii="Times New Roman" w:hAnsi="Times New Roman"/>
-          <w:szCs w:val="28"/>
-        </w:rPr>
-        <w:t>hợp</w:t>
-      </w:r>
-      <w:proofErr w:type="spellEnd"/>
-      <w:r>
-        <w:rPr>
-          <w:rFonts w:ascii="Times New Roman" w:hAnsi="Times New Roman"/>
-          <w:szCs w:val="28"/>
-        </w:rPr>
-        <w:t xml:space="preserve"> </w:t>
-      </w:r>
-      <w:proofErr w:type="spellStart"/>
-      <w:r>
-        <w:rPr>
-          <w:rFonts w:ascii="Times New Roman" w:hAnsi="Times New Roman"/>
-          <w:szCs w:val="28"/>
-        </w:rPr>
-        <w:t>giải</w:t>
-      </w:r>
-      <w:proofErr w:type="spellEnd"/>
-      <w:r>
-        <w:rPr>
-          <w:rFonts w:ascii="Times New Roman" w:hAnsi="Times New Roman"/>
-          <w:szCs w:val="28"/>
-        </w:rPr>
-        <w:t xml:space="preserve"> </w:t>
-      </w:r>
-      <w:proofErr w:type="spellStart"/>
-      <w:r>
-        <w:rPr>
-          <w:rFonts w:ascii="Times New Roman" w:hAnsi="Times New Roman"/>
-          <w:szCs w:val="28"/>
-        </w:rPr>
-        <w:t>quyết</w:t>
-      </w:r>
-      <w:proofErr w:type="spellEnd"/>
-      <w:r>
-        <w:rPr>
-          <w:rFonts w:ascii="Times New Roman" w:hAnsi="Times New Roman"/>
-          <w:szCs w:val="28"/>
-        </w:rPr>
-        <w:t>.</w:t>
-      </w:r>
+      <w:r/>
     </w:p>
     <w:p>
       <w:pPr>

</xml_diff>

<commit_message>
fix: Update webapp templates with proper tags for Mẫu 11 and 13, fix export logic
</commit_message>
<xml_diff>
--- a/templates/TOTRINH/11_Mau_Giay_trieu_tap.docx
+++ b/templates/TOTRINH/11_Mau_Giay_trieu_tap.docx
@@ -979,8 +979,220 @@
         </w:rPr>
       </w:pPr>
       <w:r>
-        <w:t xml:space="preserve"> - Thời gian: (TIME)</w:t>
-      </w:r>
+        <w:rPr>
+          <w:rFonts w:ascii="Times New Roman" w:hAnsi="Times New Roman"/>
+        </w:rPr>
+        <w:tab/>
+      </w:r>
+      <w:r>
+        <w:rPr>
+          <w:rFonts w:ascii="Times New Roman" w:hAnsi="Times New Roman"/>
+          <w:b/>
+        </w:rPr>
+        <w:t xml:space="preserve">- </w:t>
+      </w:r>
+      <w:proofErr w:type="spellStart"/>
+      <w:r>
+        <w:rPr>
+          <w:rFonts w:ascii="Times New Roman" w:hAnsi="Times New Roman"/>
+          <w:b/>
+        </w:rPr>
+        <w:t>Thời</w:t>
+      </w:r>
+      <w:proofErr w:type="spellEnd"/>
+      <w:r>
+        <w:rPr>
+          <w:rFonts w:ascii="Times New Roman" w:hAnsi="Times New Roman"/>
+          <w:b/>
+        </w:rPr>
+        <w:t xml:space="preserve"> </w:t>
+      </w:r>
+      <w:proofErr w:type="spellStart"/>
+      <w:r>
+        <w:rPr>
+          <w:rFonts w:ascii="Times New Roman" w:hAnsi="Times New Roman"/>
+          <w:b/>
+        </w:rPr>
+        <w:t>gian</w:t>
+      </w:r>
+      <w:proofErr w:type="spellEnd"/>
+      <w:r>
+        <w:rPr>
+          <w:rFonts w:ascii="Times New Roman" w:hAnsi="Times New Roman"/>
+          <w:b/>
+        </w:rPr>
+        <w:t xml:space="preserve">: </w:t>
+      </w:r>
+      <w:proofErr w:type="spellStart"/>
+      <w:r>
+        <w:rPr>
+          <w:rFonts w:ascii="Times New Roman" w:hAnsi="Times New Roman"/>
+        </w:rPr>
+        <w:t>Hội</w:t>
+      </w:r>
+      <w:proofErr w:type="spellEnd"/>
+      <w:r>
+        <w:rPr>
+          <w:rFonts w:ascii="Times New Roman" w:hAnsi="Times New Roman"/>
+        </w:rPr>
+        <w:t xml:space="preserve"> </w:t>
+      </w:r>
+      <w:proofErr w:type="spellStart"/>
+      <w:r>
+        <w:rPr>
+          <w:rFonts w:ascii="Times New Roman" w:hAnsi="Times New Roman"/>
+        </w:rPr>
+        <w:t>nghị</w:t>
+      </w:r>
+      <w:proofErr w:type="spellEnd"/>
+      <w:r>
+        <w:rPr>
+          <w:rFonts w:ascii="Times New Roman" w:hAnsi="Times New Roman"/>
+        </w:rPr>
+        <w:t xml:space="preserve"> </w:t>
+      </w:r>
+      <w:proofErr w:type="spellStart"/>
+      <w:r>
+        <w:rPr>
+          <w:rFonts w:ascii="Times New Roman" w:hAnsi="Times New Roman"/>
+        </w:rPr>
+        <w:t>làm</w:t>
+      </w:r>
+      <w:proofErr w:type="spellEnd"/>
+      <w:r>
+        <w:rPr>
+          <w:rFonts w:ascii="Times New Roman" w:hAnsi="Times New Roman"/>
+        </w:rPr>
+        <w:t xml:space="preserve"> </w:t>
+      </w:r>
+      <w:proofErr w:type="spellStart"/>
+      <w:r>
+        <w:rPr>
+          <w:rFonts w:ascii="Times New Roman" w:hAnsi="Times New Roman"/>
+        </w:rPr>
+        <w:t>việc</w:t>
+      </w:r>
+      <w:proofErr w:type="spellEnd"/>
+      <w:r>
+        <w:rPr>
+          <w:rFonts w:ascii="Times New Roman" w:hAnsi="Times New Roman"/>
+        </w:rPr>
+        <w:t xml:space="preserve"> </w:t>
+      </w:r>
+      <w:proofErr w:type="spellStart"/>
+      <w:r>
+        <w:rPr>
+          <w:rFonts w:ascii="Times New Roman" w:hAnsi="Times New Roman"/>
+        </w:rPr>
+        <w:t>trong</w:t>
+      </w:r>
+      <w:proofErr w:type="spellEnd"/>
+      <w:r>
+        <w:rPr>
+          <w:rFonts w:ascii="Times New Roman" w:hAnsi="Times New Roman"/>
+        </w:rPr>
+        <w:t>…...</w:t>
+      </w:r>
+      <w:proofErr w:type="spellStart"/>
+      <w:proofErr w:type="gramStart"/>
+      <w:r>
+        <w:rPr>
+          <w:rFonts w:ascii="Times New Roman" w:hAnsi="Times New Roman"/>
+        </w:rPr>
+        <w:t>ngày</w:t>
+      </w:r>
+      <w:proofErr w:type="spellEnd"/>
+      <w:r>
+        <w:rPr>
+          <w:rFonts w:ascii="Times New Roman" w:hAnsi="Times New Roman"/>
+        </w:rPr>
+        <w:t>,…</w:t>
+      </w:r>
+      <w:proofErr w:type="gramEnd"/>
+      <w:r>
+        <w:rPr>
+          <w:rFonts w:ascii="Times New Roman" w:hAnsi="Times New Roman"/>
+        </w:rPr>
+        <w:t xml:space="preserve">./.../...200. </w:t>
+      </w:r>
+      <w:proofErr w:type="spellStart"/>
+      <w:r>
+        <w:rPr>
+          <w:rFonts w:ascii="Times New Roman" w:hAnsi="Times New Roman"/>
+        </w:rPr>
+        <w:t>đến</w:t>
+      </w:r>
+      <w:proofErr w:type="spellEnd"/>
+      <w:r>
+        <w:rPr>
+          <w:rFonts w:ascii="Times New Roman" w:hAnsi="Times New Roman"/>
+        </w:rPr>
+        <w:t xml:space="preserve"> …/…/20., </w:t>
+      </w:r>
+      <w:proofErr w:type="spellStart"/>
+      <w:r>
+        <w:rPr>
+          <w:rFonts w:ascii="Times New Roman" w:hAnsi="Times New Roman"/>
+        </w:rPr>
+        <w:t>khai</w:t>
+      </w:r>
+      <w:proofErr w:type="spellEnd"/>
+      <w:r>
+        <w:rPr>
+          <w:rFonts w:ascii="Times New Roman" w:hAnsi="Times New Roman"/>
+        </w:rPr>
+        <w:t xml:space="preserve"> </w:t>
+      </w:r>
+      <w:proofErr w:type="spellStart"/>
+      <w:r>
+        <w:rPr>
+          <w:rFonts w:ascii="Times New Roman" w:hAnsi="Times New Roman"/>
+        </w:rPr>
+        <w:t>mạc</w:t>
+      </w:r>
+      <w:proofErr w:type="spellEnd"/>
+      <w:r>
+        <w:rPr>
+          <w:rFonts w:ascii="Times New Roman" w:hAnsi="Times New Roman"/>
+        </w:rPr>
+        <w:t xml:space="preserve"> </w:t>
+      </w:r>
+      <w:proofErr w:type="spellStart"/>
+      <w:r>
+        <w:rPr>
+          <w:rFonts w:ascii="Times New Roman" w:hAnsi="Times New Roman"/>
+        </w:rPr>
+        <w:t>lúc</w:t>
+      </w:r>
+      <w:proofErr w:type="spellEnd"/>
+      <w:r>
+        <w:rPr>
+          <w:rFonts w:ascii="Times New Roman" w:hAnsi="Times New Roman"/>
+        </w:rPr>
+        <w:t xml:space="preserve">…h00 </w:t>
+      </w:r>
+      <w:proofErr w:type="spellStart"/>
+      <w:r>
+        <w:rPr>
+          <w:rFonts w:ascii="Times New Roman" w:hAnsi="Times New Roman"/>
+        </w:rPr>
+        <w:t>ngày</w:t>
+      </w:r>
+      <w:proofErr w:type="spellEnd"/>
+      <w:r>
+        <w:rPr>
+          <w:rFonts w:ascii="Times New Roman" w:hAnsi="Times New Roman"/>
+        </w:rPr>
+        <w:t>…/…/</w:t>
+      </w:r>
+      <w:proofErr w:type="gramStart"/>
+      <w:r>
+        <w:rPr>
+          <w:rFonts w:ascii="Times New Roman" w:hAnsi="Times New Roman"/>
+        </w:rPr>
+        <w:t>20..</w:t>
+      </w:r>
+      <w:proofErr w:type="gramEnd"/>
     </w:p>
     <w:p>
       <w:pPr>
@@ -993,7 +1205,63 @@
         </w:rPr>
       </w:pPr>
       <w:r>
-        <w:t xml:space="preserve"> - Địa điểm: (LOCATION)</w:t>
+        <w:rPr>
+          <w:rFonts w:ascii="Times New Roman" w:hAnsi="Times New Roman"/>
+        </w:rPr>
+        <w:tab/>
+      </w:r>
+      <w:r>
+        <w:rPr>
+          <w:rFonts w:ascii="Times New Roman" w:hAnsi="Times New Roman"/>
+          <w:b/>
+        </w:rPr>
+        <w:t xml:space="preserve">- </w:t>
+      </w:r>
+      <w:proofErr w:type="spellStart"/>
+      <w:r>
+        <w:rPr>
+          <w:rFonts w:ascii="Times New Roman" w:hAnsi="Times New Roman"/>
+          <w:b/>
+        </w:rPr>
+        <w:t>Địa</w:t>
+      </w:r>
+      <w:proofErr w:type="spellEnd"/>
+      <w:r>
+        <w:rPr>
+          <w:rFonts w:ascii="Times New Roman" w:hAnsi="Times New Roman"/>
+          <w:b/>
+        </w:rPr>
+        <w:t xml:space="preserve"> </w:t>
+      </w:r>
+      <w:proofErr w:type="spellStart"/>
+      <w:proofErr w:type="gramStart"/>
+      <w:r>
+        <w:rPr>
+          <w:rFonts w:ascii="Times New Roman" w:hAnsi="Times New Roman"/>
+          <w:b/>
+        </w:rPr>
+        <w:t>điểm</w:t>
+      </w:r>
+      <w:proofErr w:type="spellEnd"/>
+      <w:r>
+        <w:rPr>
+          <w:rFonts w:ascii="Times New Roman" w:hAnsi="Times New Roman"/>
+          <w:b/>
+        </w:rPr>
+        <w:t>:</w:t>
+      </w:r>
+      <w:r>
+        <w:rPr>
+          <w:rFonts w:ascii="Times New Roman" w:hAnsi="Times New Roman"/>
+        </w:rPr>
+        <w:t>…</w:t>
+      </w:r>
+      <w:proofErr w:type="gramEnd"/>
+      <w:r>
+        <w:rPr>
+          <w:rFonts w:ascii="Times New Roman" w:hAnsi="Times New Roman"/>
+        </w:rPr>
+        <w:t>…………………….</w:t>
       </w:r>
     </w:p>
     <w:p>
@@ -1110,7 +1378,53 @@
         </w:rPr>
       </w:pPr>
       <w:r>
-        <w:t xml:space="preserve"> (PARTICIPANTS)</w:t>
+        <w:rPr>
+          <w:rFonts w:ascii="Times New Roman" w:hAnsi="Times New Roman"/>
+        </w:rPr>
+        <w:tab/>
+        <w:t xml:space="preserve">a. </w:t>
+      </w:r>
+      <w:proofErr w:type="spellStart"/>
+      <w:r>
+        <w:rPr>
+          <w:rFonts w:ascii="Times New Roman" w:hAnsi="Times New Roman"/>
+        </w:rPr>
+        <w:t>Khối</w:t>
+      </w:r>
+      <w:proofErr w:type="spellEnd"/>
+      <w:r>
+        <w:rPr>
+          <w:rFonts w:ascii="Times New Roman" w:hAnsi="Times New Roman"/>
+        </w:rPr>
+        <w:t xml:space="preserve"> </w:t>
+      </w:r>
+      <w:proofErr w:type="spellStart"/>
+      <w:r>
+        <w:rPr>
+          <w:rFonts w:ascii="Times New Roman" w:hAnsi="Times New Roman"/>
+        </w:rPr>
+        <w:t>cơ</w:t>
+      </w:r>
+      <w:proofErr w:type="spellEnd"/>
+      <w:r>
+        <w:rPr>
+          <w:rFonts w:ascii="Times New Roman" w:hAnsi="Times New Roman"/>
+        </w:rPr>
+        <w:t xml:space="preserve"> </w:t>
+      </w:r>
+      <w:proofErr w:type="spellStart"/>
+      <w:r>
+        <w:rPr>
+          <w:rFonts w:ascii="Times New Roman" w:hAnsi="Times New Roman"/>
+        </w:rPr>
+        <w:t>quan</w:t>
+      </w:r>
+      <w:proofErr w:type="spellEnd"/>
+      <w:r>
+        <w:rPr>
+          <w:rFonts w:ascii="Times New Roman" w:hAnsi="Times New Roman"/>
+        </w:rPr>
+        <w:t>….:</w:t>
       </w:r>
     </w:p>
     <w:p>
@@ -1123,7 +1437,69 @@
           <w:rFonts w:ascii="Times New Roman" w:hAnsi="Times New Roman"/>
         </w:rPr>
       </w:pPr>
-      <w:r/>
+      <w:r>
+        <w:rPr>
+          <w:rFonts w:ascii="Times New Roman" w:hAnsi="Times New Roman"/>
+        </w:rPr>
+        <w:tab/>
+        <w:t xml:space="preserve">b. Các </w:t>
+      </w:r>
+      <w:proofErr w:type="spellStart"/>
+      <w:r>
+        <w:rPr>
+          <w:rFonts w:ascii="Times New Roman" w:hAnsi="Times New Roman"/>
+        </w:rPr>
+        <w:t>đơn</w:t>
+      </w:r>
+      <w:proofErr w:type="spellEnd"/>
+      <w:r>
+        <w:rPr>
+          <w:rFonts w:ascii="Times New Roman" w:hAnsi="Times New Roman"/>
+        </w:rPr>
+        <w:t xml:space="preserve"> </w:t>
+      </w:r>
+      <w:proofErr w:type="spellStart"/>
+      <w:r>
+        <w:rPr>
+          <w:rFonts w:ascii="Times New Roman" w:hAnsi="Times New Roman"/>
+        </w:rPr>
+        <w:t>vị</w:t>
+      </w:r>
+      <w:proofErr w:type="spellEnd"/>
+      <w:r>
+        <w:rPr>
+          <w:rFonts w:ascii="Times New Roman" w:hAnsi="Times New Roman"/>
+        </w:rPr>
+        <w:t xml:space="preserve"> </w:t>
+      </w:r>
+      <w:proofErr w:type="spellStart"/>
+      <w:r>
+        <w:rPr>
+          <w:rFonts w:ascii="Times New Roman" w:hAnsi="Times New Roman"/>
+        </w:rPr>
+        <w:t>trực</w:t>
+      </w:r>
+      <w:proofErr w:type="spellEnd"/>
+      <w:r>
+        <w:rPr>
+          <w:rFonts w:ascii="Times New Roman" w:hAnsi="Times New Roman"/>
+        </w:rPr>
+        <w:t xml:space="preserve"> </w:t>
+      </w:r>
+      <w:proofErr w:type="spellStart"/>
+      <w:r>
+        <w:rPr>
+          <w:rFonts w:ascii="Times New Roman" w:hAnsi="Times New Roman"/>
+        </w:rPr>
+        <w:t>thuộc</w:t>
+      </w:r>
+      <w:proofErr w:type="spellEnd"/>
+      <w:r>
+        <w:rPr>
+          <w:rFonts w:ascii="Times New Roman" w:hAnsi="Times New Roman"/>
+        </w:rPr>
+        <w:t>:</w:t>
+      </w:r>
     </w:p>
     <w:p>
       <w:pPr>
@@ -1206,8 +1582,287 @@
         </w:rPr>
       </w:pPr>
       <w:r>
-        <w:t xml:space="preserve"> (ORGANIZATION)</w:t>
-      </w:r>
+        <w:rPr>
+          <w:rFonts w:ascii="Times New Roman" w:hAnsi="Times New Roman"/>
+        </w:rPr>
+        <w:tab/>
+        <w:t xml:space="preserve">- Các </w:t>
+      </w:r>
+      <w:proofErr w:type="spellStart"/>
+      <w:r>
+        <w:rPr>
+          <w:rFonts w:ascii="Times New Roman" w:hAnsi="Times New Roman"/>
+        </w:rPr>
+        <w:t>đơn</w:t>
+      </w:r>
+      <w:proofErr w:type="spellEnd"/>
+      <w:r>
+        <w:rPr>
+          <w:rFonts w:ascii="Times New Roman" w:hAnsi="Times New Roman"/>
+        </w:rPr>
+        <w:t xml:space="preserve"> </w:t>
+      </w:r>
+      <w:proofErr w:type="spellStart"/>
+      <w:r>
+        <w:rPr>
+          <w:rFonts w:ascii="Times New Roman" w:hAnsi="Times New Roman"/>
+        </w:rPr>
+        <w:t>vị</w:t>
+      </w:r>
+      <w:proofErr w:type="spellEnd"/>
+      <w:r>
+        <w:rPr>
+          <w:rFonts w:ascii="Times New Roman" w:hAnsi="Times New Roman"/>
+        </w:rPr>
+        <w:t xml:space="preserve"> </w:t>
+      </w:r>
+      <w:proofErr w:type="spellStart"/>
+      <w:r>
+        <w:rPr>
+          <w:rFonts w:ascii="Times New Roman" w:hAnsi="Times New Roman"/>
+        </w:rPr>
+        <w:t>tham</w:t>
+      </w:r>
+      <w:proofErr w:type="spellEnd"/>
+      <w:r>
+        <w:rPr>
+          <w:rFonts w:ascii="Times New Roman" w:hAnsi="Times New Roman"/>
+        </w:rPr>
+        <w:t xml:space="preserve"> </w:t>
+      </w:r>
+      <w:proofErr w:type="spellStart"/>
+      <w:r>
+        <w:rPr>
+          <w:rFonts w:ascii="Times New Roman" w:hAnsi="Times New Roman"/>
+        </w:rPr>
+        <w:t>dự</w:t>
+      </w:r>
+      <w:proofErr w:type="spellEnd"/>
+      <w:r>
+        <w:rPr>
+          <w:rFonts w:ascii="Times New Roman" w:hAnsi="Times New Roman"/>
+        </w:rPr>
+        <w:t xml:space="preserve"> </w:t>
+      </w:r>
+      <w:proofErr w:type="spellStart"/>
+      <w:r>
+        <w:rPr>
+          <w:rFonts w:ascii="Times New Roman" w:hAnsi="Times New Roman"/>
+        </w:rPr>
+        <w:t>đủ</w:t>
+      </w:r>
+      <w:proofErr w:type="spellEnd"/>
+      <w:r>
+        <w:rPr>
+          <w:rFonts w:ascii="Times New Roman" w:hAnsi="Times New Roman"/>
+        </w:rPr>
+        <w:t xml:space="preserve">, </w:t>
+      </w:r>
+      <w:proofErr w:type="spellStart"/>
+      <w:r>
+        <w:rPr>
+          <w:rFonts w:ascii="Times New Roman" w:hAnsi="Times New Roman"/>
+        </w:rPr>
+        <w:t>đúng</w:t>
+      </w:r>
+      <w:proofErr w:type="spellEnd"/>
+      <w:r>
+        <w:rPr>
+          <w:rFonts w:ascii="Times New Roman" w:hAnsi="Times New Roman"/>
+        </w:rPr>
+        <w:t xml:space="preserve"> </w:t>
+      </w:r>
+      <w:proofErr w:type="spellStart"/>
+      <w:r>
+        <w:rPr>
+          <w:rFonts w:ascii="Times New Roman" w:hAnsi="Times New Roman"/>
+        </w:rPr>
+        <w:t>thành</w:t>
+      </w:r>
+      <w:proofErr w:type="spellEnd"/>
+      <w:r>
+        <w:rPr>
+          <w:rFonts w:ascii="Times New Roman" w:hAnsi="Times New Roman"/>
+        </w:rPr>
+        <w:t xml:space="preserve"> </w:t>
+      </w:r>
+      <w:proofErr w:type="spellStart"/>
+      <w:proofErr w:type="gramStart"/>
+      <w:r>
+        <w:rPr>
+          <w:rFonts w:ascii="Times New Roman" w:hAnsi="Times New Roman"/>
+        </w:rPr>
+        <w:t>phần</w:t>
+      </w:r>
+      <w:proofErr w:type="spellEnd"/>
+      <w:r>
+        <w:rPr>
+          <w:rFonts w:ascii="Times New Roman" w:hAnsi="Times New Roman"/>
+        </w:rPr>
+        <w:t>..</w:t>
+      </w:r>
+      <w:proofErr w:type="gramEnd"/>
+      <w:r>
+        <w:rPr>
+          <w:rFonts w:ascii="Times New Roman" w:hAnsi="Times New Roman"/>
+          <w:sz w:val="23"/>
+          <w:szCs w:val="23"/>
+        </w:rPr>
+        <w:t>(</w:t>
+      </w:r>
+      <w:proofErr w:type="spellStart"/>
+      <w:r>
+        <w:rPr>
+          <w:rFonts w:ascii="Times New Roman" w:hAnsi="Times New Roman"/>
+          <w:sz w:val="23"/>
+          <w:szCs w:val="23"/>
+        </w:rPr>
+        <w:t>nêu</w:t>
+      </w:r>
+      <w:proofErr w:type="spellEnd"/>
+      <w:r>
+        <w:rPr>
+          <w:rFonts w:ascii="Times New Roman" w:hAnsi="Times New Roman"/>
+          <w:sz w:val="23"/>
+          <w:szCs w:val="23"/>
+        </w:rPr>
+        <w:t xml:space="preserve"> </w:t>
+      </w:r>
+      <w:proofErr w:type="spellStart"/>
+      <w:r>
+        <w:rPr>
+          <w:rFonts w:ascii="Times New Roman" w:hAnsi="Times New Roman"/>
+          <w:sz w:val="23"/>
+          <w:szCs w:val="23"/>
+        </w:rPr>
+        <w:t>phương</w:t>
+      </w:r>
+      <w:proofErr w:type="spellEnd"/>
+      <w:r>
+        <w:rPr>
+          <w:rFonts w:ascii="Times New Roman" w:hAnsi="Times New Roman"/>
+          <w:sz w:val="23"/>
+          <w:szCs w:val="23"/>
+        </w:rPr>
+        <w:t xml:space="preserve"> </w:t>
+      </w:r>
+      <w:proofErr w:type="spellStart"/>
+      <w:r>
+        <w:rPr>
+          <w:rFonts w:ascii="Times New Roman" w:hAnsi="Times New Roman"/>
+          <w:sz w:val="23"/>
+          <w:szCs w:val="23"/>
+        </w:rPr>
+        <w:t>tiện</w:t>
+      </w:r>
+      <w:proofErr w:type="spellEnd"/>
+      <w:r>
+        <w:rPr>
+          <w:rFonts w:ascii="Times New Roman" w:hAnsi="Times New Roman"/>
+          <w:sz w:val="23"/>
+          <w:szCs w:val="23"/>
+        </w:rPr>
+        <w:t xml:space="preserve"> </w:t>
+      </w:r>
+      <w:proofErr w:type="spellStart"/>
+      <w:r>
+        <w:rPr>
+          <w:rFonts w:ascii="Times New Roman" w:hAnsi="Times New Roman"/>
+          <w:sz w:val="23"/>
+          <w:szCs w:val="23"/>
+        </w:rPr>
+        <w:t>đi</w:t>
+      </w:r>
+      <w:proofErr w:type="spellEnd"/>
+      <w:r>
+        <w:rPr>
+          <w:rFonts w:ascii="Times New Roman" w:hAnsi="Times New Roman"/>
+          <w:sz w:val="23"/>
+          <w:szCs w:val="23"/>
+        </w:rPr>
+        <w:t xml:space="preserve"> </w:t>
+      </w:r>
+      <w:proofErr w:type="spellStart"/>
+      <w:r>
+        <w:rPr>
+          <w:rFonts w:ascii="Times New Roman" w:hAnsi="Times New Roman"/>
+          <w:sz w:val="23"/>
+          <w:szCs w:val="23"/>
+        </w:rPr>
+        <w:t>lại</w:t>
+      </w:r>
+      <w:proofErr w:type="spellEnd"/>
+      <w:r>
+        <w:rPr>
+          <w:rFonts w:ascii="Times New Roman" w:hAnsi="Times New Roman"/>
+          <w:sz w:val="23"/>
+          <w:szCs w:val="23"/>
+        </w:rPr>
+        <w:t xml:space="preserve"> </w:t>
+      </w:r>
+      <w:proofErr w:type="spellStart"/>
+      <w:r>
+        <w:rPr>
+          <w:rFonts w:ascii="Times New Roman" w:hAnsi="Times New Roman"/>
+          <w:sz w:val="23"/>
+          <w:szCs w:val="23"/>
+        </w:rPr>
+        <w:t>của</w:t>
+      </w:r>
+      <w:proofErr w:type="spellEnd"/>
+      <w:r>
+        <w:rPr>
+          <w:rFonts w:ascii="Times New Roman" w:hAnsi="Times New Roman"/>
+          <w:sz w:val="23"/>
+          <w:szCs w:val="23"/>
+        </w:rPr>
+        <w:t xml:space="preserve"> </w:t>
+      </w:r>
+      <w:proofErr w:type="spellStart"/>
+      <w:r>
+        <w:rPr>
+          <w:rFonts w:ascii="Times New Roman" w:hAnsi="Times New Roman"/>
+          <w:sz w:val="23"/>
+          <w:szCs w:val="23"/>
+        </w:rPr>
+        <w:t>đại</w:t>
+      </w:r>
+      <w:proofErr w:type="spellEnd"/>
+      <w:r>
+        <w:rPr>
+          <w:rFonts w:ascii="Times New Roman" w:hAnsi="Times New Roman"/>
+          <w:sz w:val="23"/>
+          <w:szCs w:val="23"/>
+        </w:rPr>
+        <w:t xml:space="preserve"> </w:t>
+      </w:r>
+      <w:proofErr w:type="spellStart"/>
+      <w:proofErr w:type="gramStart"/>
+      <w:r>
+        <w:rPr>
+          <w:rFonts w:ascii="Times New Roman" w:hAnsi="Times New Roman"/>
+          <w:sz w:val="23"/>
+          <w:szCs w:val="23"/>
+        </w:rPr>
+        <w:t>biểu</w:t>
+      </w:r>
+      <w:proofErr w:type="spellEnd"/>
+      <w:r>
+        <w:rPr>
+          <w:rFonts w:ascii="Times New Roman" w:hAnsi="Times New Roman"/>
+          <w:sz w:val="23"/>
+          <w:szCs w:val="23"/>
+        </w:rPr>
+        <w:t>)</w:t>
+      </w:r>
+      <w:r>
+        <w:rPr>
+          <w:rFonts w:ascii="Times New Roman" w:hAnsi="Times New Roman"/>
+          <w:sz w:val="20"/>
+        </w:rPr>
+        <w:t>…</w:t>
+      </w:r>
+      <w:proofErr w:type="gramEnd"/>
     </w:p>
     <w:p>
       <w:pPr>
@@ -1219,7 +1874,363 @@
           <w:rFonts w:ascii="Times New Roman" w:hAnsi="Times New Roman"/>
         </w:rPr>
       </w:pPr>
-      <w:r/>
+      <w:r>
+        <w:rPr>
+          <w:rFonts w:ascii="Times New Roman" w:hAnsi="Times New Roman"/>
+        </w:rPr>
+        <w:tab/>
+        <w:t xml:space="preserve">- Ban </w:t>
+      </w:r>
+      <w:proofErr w:type="spellStart"/>
+      <w:r>
+        <w:rPr>
+          <w:rFonts w:ascii="Times New Roman" w:hAnsi="Times New Roman"/>
+        </w:rPr>
+        <w:t>tổ</w:t>
+      </w:r>
+      <w:proofErr w:type="spellEnd"/>
+      <w:r>
+        <w:rPr>
+          <w:rFonts w:ascii="Times New Roman" w:hAnsi="Times New Roman"/>
+        </w:rPr>
+        <w:t xml:space="preserve"> </w:t>
+      </w:r>
+      <w:proofErr w:type="spellStart"/>
+      <w:r>
+        <w:rPr>
+          <w:rFonts w:ascii="Times New Roman" w:hAnsi="Times New Roman"/>
+        </w:rPr>
+        <w:t>chức</w:t>
+      </w:r>
+      <w:proofErr w:type="spellEnd"/>
+      <w:r>
+        <w:rPr>
+          <w:rFonts w:ascii="Times New Roman" w:hAnsi="Times New Roman"/>
+        </w:rPr>
+        <w:t xml:space="preserve"> </w:t>
+      </w:r>
+      <w:proofErr w:type="spellStart"/>
+      <w:r>
+        <w:rPr>
+          <w:rFonts w:ascii="Times New Roman" w:hAnsi="Times New Roman"/>
+        </w:rPr>
+        <w:t>Hội</w:t>
+      </w:r>
+      <w:proofErr w:type="spellEnd"/>
+      <w:r>
+        <w:rPr>
+          <w:rFonts w:ascii="Times New Roman" w:hAnsi="Times New Roman"/>
+        </w:rPr>
+        <w:t xml:space="preserve"> </w:t>
+      </w:r>
+      <w:proofErr w:type="spellStart"/>
+      <w:r>
+        <w:rPr>
+          <w:rFonts w:ascii="Times New Roman" w:hAnsi="Times New Roman"/>
+        </w:rPr>
+        <w:t>nghị</w:t>
+      </w:r>
+      <w:proofErr w:type="spellEnd"/>
+      <w:r>
+        <w:rPr>
+          <w:rFonts w:ascii="Times New Roman" w:hAnsi="Times New Roman"/>
+        </w:rPr>
+        <w:t xml:space="preserve"> </w:t>
+      </w:r>
+      <w:proofErr w:type="spellStart"/>
+      <w:r>
+        <w:rPr>
+          <w:rFonts w:ascii="Times New Roman" w:hAnsi="Times New Roman"/>
+        </w:rPr>
+        <w:t>đón</w:t>
+      </w:r>
+      <w:proofErr w:type="spellEnd"/>
+      <w:r>
+        <w:rPr>
+          <w:rFonts w:ascii="Times New Roman" w:hAnsi="Times New Roman"/>
+        </w:rPr>
+        <w:t xml:space="preserve"> </w:t>
+      </w:r>
+      <w:proofErr w:type="spellStart"/>
+      <w:r>
+        <w:rPr>
+          <w:rFonts w:ascii="Times New Roman" w:hAnsi="Times New Roman"/>
+        </w:rPr>
+        <w:t>tiếp</w:t>
+      </w:r>
+      <w:proofErr w:type="spellEnd"/>
+      <w:r>
+        <w:rPr>
+          <w:rFonts w:ascii="Times New Roman" w:hAnsi="Times New Roman"/>
+        </w:rPr>
+        <w:t xml:space="preserve"> </w:t>
+      </w:r>
+      <w:proofErr w:type="spellStart"/>
+      <w:r>
+        <w:rPr>
+          <w:rFonts w:ascii="Times New Roman" w:hAnsi="Times New Roman"/>
+        </w:rPr>
+        <w:t>và</w:t>
+      </w:r>
+      <w:proofErr w:type="spellEnd"/>
+      <w:r>
+        <w:rPr>
+          <w:rFonts w:ascii="Times New Roman" w:hAnsi="Times New Roman"/>
+        </w:rPr>
+        <w:t xml:space="preserve"> </w:t>
+      </w:r>
+      <w:proofErr w:type="spellStart"/>
+      <w:r>
+        <w:rPr>
+          <w:rFonts w:ascii="Times New Roman" w:hAnsi="Times New Roman"/>
+        </w:rPr>
+        <w:t>phát</w:t>
+      </w:r>
+      <w:proofErr w:type="spellEnd"/>
+      <w:r>
+        <w:rPr>
+          <w:rFonts w:ascii="Times New Roman" w:hAnsi="Times New Roman"/>
+        </w:rPr>
+        <w:t xml:space="preserve"> </w:t>
+      </w:r>
+      <w:proofErr w:type="spellStart"/>
+      <w:r>
+        <w:rPr>
+          <w:rFonts w:ascii="Times New Roman" w:hAnsi="Times New Roman"/>
+        </w:rPr>
+        <w:t>tài</w:t>
+      </w:r>
+      <w:proofErr w:type="spellEnd"/>
+      <w:r>
+        <w:rPr>
+          <w:rFonts w:ascii="Times New Roman" w:hAnsi="Times New Roman"/>
+        </w:rPr>
+        <w:t xml:space="preserve"> </w:t>
+      </w:r>
+      <w:proofErr w:type="spellStart"/>
+      <w:r>
+        <w:rPr>
+          <w:rFonts w:ascii="Times New Roman" w:hAnsi="Times New Roman"/>
+        </w:rPr>
+        <w:t>liệu</w:t>
+      </w:r>
+      <w:proofErr w:type="spellEnd"/>
+      <w:r>
+        <w:rPr>
+          <w:rFonts w:ascii="Times New Roman" w:hAnsi="Times New Roman"/>
+        </w:rPr>
+        <w:t xml:space="preserve"> </w:t>
+      </w:r>
+      <w:proofErr w:type="spellStart"/>
+      <w:r>
+        <w:rPr>
+          <w:rFonts w:ascii="Times New Roman" w:hAnsi="Times New Roman"/>
+        </w:rPr>
+        <w:t>tới</w:t>
+      </w:r>
+      <w:proofErr w:type="spellEnd"/>
+      <w:r>
+        <w:rPr>
+          <w:rFonts w:ascii="Times New Roman" w:hAnsi="Times New Roman"/>
+        </w:rPr>
+        <w:t xml:space="preserve"> </w:t>
+      </w:r>
+      <w:proofErr w:type="spellStart"/>
+      <w:r>
+        <w:rPr>
+          <w:rFonts w:ascii="Times New Roman" w:hAnsi="Times New Roman"/>
+        </w:rPr>
+        <w:t>các</w:t>
+      </w:r>
+      <w:proofErr w:type="spellEnd"/>
+      <w:r>
+        <w:rPr>
+          <w:rFonts w:ascii="Times New Roman" w:hAnsi="Times New Roman"/>
+        </w:rPr>
+        <w:t xml:space="preserve"> </w:t>
+      </w:r>
+      <w:proofErr w:type="spellStart"/>
+      <w:r>
+        <w:rPr>
+          <w:rFonts w:ascii="Times New Roman" w:hAnsi="Times New Roman"/>
+        </w:rPr>
+        <w:t>đại</w:t>
+      </w:r>
+      <w:proofErr w:type="spellEnd"/>
+      <w:r>
+        <w:rPr>
+          <w:rFonts w:ascii="Times New Roman" w:hAnsi="Times New Roman"/>
+        </w:rPr>
+        <w:t xml:space="preserve"> </w:t>
+      </w:r>
+      <w:proofErr w:type="spellStart"/>
+      <w:r>
+        <w:rPr>
+          <w:rFonts w:ascii="Times New Roman" w:hAnsi="Times New Roman"/>
+        </w:rPr>
+        <w:t>biểu</w:t>
+      </w:r>
+      <w:proofErr w:type="spellEnd"/>
+      <w:r>
+        <w:rPr>
+          <w:rFonts w:ascii="Times New Roman" w:hAnsi="Times New Roman"/>
+        </w:rPr>
+        <w:t xml:space="preserve">, </w:t>
+      </w:r>
+      <w:proofErr w:type="spellStart"/>
+      <w:r>
+        <w:rPr>
+          <w:rFonts w:ascii="Times New Roman" w:hAnsi="Times New Roman"/>
+        </w:rPr>
+        <w:t>bắt</w:t>
+      </w:r>
+      <w:proofErr w:type="spellEnd"/>
+      <w:r>
+        <w:rPr>
+          <w:rFonts w:ascii="Times New Roman" w:hAnsi="Times New Roman"/>
+        </w:rPr>
+        <w:t xml:space="preserve"> </w:t>
+      </w:r>
+      <w:proofErr w:type="spellStart"/>
+      <w:r>
+        <w:rPr>
+          <w:rFonts w:ascii="Times New Roman" w:hAnsi="Times New Roman"/>
+        </w:rPr>
+        <w:t>đầu</w:t>
+      </w:r>
+      <w:proofErr w:type="spellEnd"/>
+      <w:r>
+        <w:rPr>
+          <w:rFonts w:ascii="Times New Roman" w:hAnsi="Times New Roman"/>
+        </w:rPr>
+        <w:t xml:space="preserve"> </w:t>
+      </w:r>
+      <w:proofErr w:type="spellStart"/>
+      <w:r>
+        <w:rPr>
+          <w:rFonts w:ascii="Times New Roman" w:hAnsi="Times New Roman"/>
+        </w:rPr>
+        <w:t>từ</w:t>
+      </w:r>
+      <w:proofErr w:type="spellEnd"/>
+      <w:r>
+        <w:rPr>
+          <w:rFonts w:ascii="Times New Roman" w:hAnsi="Times New Roman"/>
+        </w:rPr>
+        <w:t xml:space="preserve">…h00, </w:t>
+      </w:r>
+      <w:proofErr w:type="spellStart"/>
+      <w:r>
+        <w:rPr>
+          <w:rFonts w:ascii="Times New Roman" w:hAnsi="Times New Roman"/>
+        </w:rPr>
+        <w:t>ngày</w:t>
+      </w:r>
+      <w:proofErr w:type="spellEnd"/>
+      <w:r>
+        <w:rPr>
+          <w:rFonts w:ascii="Times New Roman" w:hAnsi="Times New Roman"/>
+        </w:rPr>
+        <w:t xml:space="preserve">…/…/200. </w:t>
+      </w:r>
+      <w:proofErr w:type="spellStart"/>
+      <w:r>
+        <w:rPr>
+          <w:rFonts w:ascii="Times New Roman" w:hAnsi="Times New Roman"/>
+        </w:rPr>
+        <w:t>tại</w:t>
+      </w:r>
+      <w:proofErr w:type="spellEnd"/>
+      <w:r>
+        <w:rPr>
+          <w:rFonts w:ascii="Times New Roman" w:hAnsi="Times New Roman"/>
+        </w:rPr>
+        <w:t>………</w:t>
+      </w:r>
+      <w:proofErr w:type="gramStart"/>
+      <w:r>
+        <w:rPr>
+          <w:rFonts w:ascii="Times New Roman" w:hAnsi="Times New Roman"/>
+        </w:rPr>
+        <w:t>…..</w:t>
+      </w:r>
+      <w:proofErr w:type="gramEnd"/>
+      <w:r>
+        <w:rPr>
+          <w:rFonts w:ascii="Times New Roman" w:hAnsi="Times New Roman"/>
+        </w:rPr>
+        <w:t>(</w:t>
+      </w:r>
+      <w:proofErr w:type="spellStart"/>
+      <w:r>
+        <w:rPr>
+          <w:rFonts w:ascii="Times New Roman" w:hAnsi="Times New Roman"/>
+        </w:rPr>
+        <w:t>điện</w:t>
+      </w:r>
+      <w:proofErr w:type="spellEnd"/>
+      <w:r>
+        <w:rPr>
+          <w:rFonts w:ascii="Times New Roman" w:hAnsi="Times New Roman"/>
+        </w:rPr>
+        <w:t xml:space="preserve"> </w:t>
+      </w:r>
+      <w:proofErr w:type="spellStart"/>
+      <w:r>
+        <w:rPr>
+          <w:rFonts w:ascii="Times New Roman" w:hAnsi="Times New Roman"/>
+        </w:rPr>
+        <w:t>thoại</w:t>
+      </w:r>
+      <w:proofErr w:type="spellEnd"/>
+      <w:r>
+        <w:rPr>
+          <w:rFonts w:ascii="Times New Roman" w:hAnsi="Times New Roman"/>
+        </w:rPr>
+        <w:t xml:space="preserve"> </w:t>
+      </w:r>
+      <w:proofErr w:type="spellStart"/>
+      <w:r>
+        <w:rPr>
+          <w:rFonts w:ascii="Times New Roman" w:hAnsi="Times New Roman"/>
+        </w:rPr>
+        <w:t>liên</w:t>
+      </w:r>
+      <w:proofErr w:type="spellEnd"/>
+      <w:r>
+        <w:rPr>
+          <w:rFonts w:ascii="Times New Roman" w:hAnsi="Times New Roman"/>
+        </w:rPr>
+        <w:t xml:space="preserve"> </w:t>
+      </w:r>
+      <w:proofErr w:type="spellStart"/>
+      <w:r>
+        <w:rPr>
+          <w:rFonts w:ascii="Times New Roman" w:hAnsi="Times New Roman"/>
+        </w:rPr>
+        <w:t>hệ</w:t>
+      </w:r>
+      <w:proofErr w:type="spellEnd"/>
+      <w:r>
+        <w:rPr>
+          <w:rFonts w:ascii="Times New Roman" w:hAnsi="Times New Roman"/>
+        </w:rPr>
+        <w:t>……………</w:t>
+      </w:r>
+      <w:proofErr w:type="gramStart"/>
+      <w:r>
+        <w:rPr>
+          <w:rFonts w:ascii="Times New Roman" w:hAnsi="Times New Roman"/>
+        </w:rPr>
+        <w:t>…..</w:t>
+      </w:r>
+      <w:proofErr w:type="gramEnd"/>
+      <w:r>
+        <w:rPr>
+          <w:rFonts w:ascii="Times New Roman" w:hAnsi="Times New Roman"/>
+        </w:rPr>
+        <w:t>).</w:t>
+      </w:r>
     </w:p>
     <w:p>
       <w:pPr>
@@ -1232,7 +2243,470 @@
           <w:szCs w:val="28"/>
         </w:rPr>
       </w:pPr>
-      <w:r/>
+      <w:r>
+        <w:rPr>
+          <w:rFonts w:ascii="Times New Roman" w:hAnsi="Times New Roman"/>
+          <w:sz w:val="24"/>
+        </w:rPr>
+        <w:tab/>
+      </w:r>
+      <w:r>
+        <w:rPr>
+          <w:rFonts w:ascii="Times New Roman" w:hAnsi="Times New Roman"/>
+          <w:szCs w:val="28"/>
+        </w:rPr>
+        <w:t xml:space="preserve">- Trong </w:t>
+      </w:r>
+      <w:proofErr w:type="spellStart"/>
+      <w:r>
+        <w:rPr>
+          <w:rFonts w:ascii="Times New Roman" w:hAnsi="Times New Roman"/>
+          <w:szCs w:val="28"/>
+        </w:rPr>
+        <w:t>quá</w:t>
+      </w:r>
+      <w:proofErr w:type="spellEnd"/>
+      <w:r>
+        <w:rPr>
+          <w:rFonts w:ascii="Times New Roman" w:hAnsi="Times New Roman"/>
+          <w:szCs w:val="28"/>
+        </w:rPr>
+        <w:t xml:space="preserve"> </w:t>
+      </w:r>
+      <w:proofErr w:type="spellStart"/>
+      <w:r>
+        <w:rPr>
+          <w:rFonts w:ascii="Times New Roman" w:hAnsi="Times New Roman"/>
+          <w:szCs w:val="28"/>
+        </w:rPr>
+        <w:t>trình</w:t>
+      </w:r>
+      <w:proofErr w:type="spellEnd"/>
+      <w:r>
+        <w:rPr>
+          <w:rFonts w:ascii="Times New Roman" w:hAnsi="Times New Roman"/>
+          <w:szCs w:val="28"/>
+        </w:rPr>
+        <w:t xml:space="preserve"> </w:t>
+      </w:r>
+      <w:proofErr w:type="spellStart"/>
+      <w:r>
+        <w:rPr>
+          <w:rFonts w:ascii="Times New Roman" w:hAnsi="Times New Roman"/>
+          <w:szCs w:val="28"/>
+        </w:rPr>
+        <w:t>triển</w:t>
+      </w:r>
+      <w:proofErr w:type="spellEnd"/>
+      <w:r>
+        <w:rPr>
+          <w:rFonts w:ascii="Times New Roman" w:hAnsi="Times New Roman"/>
+          <w:szCs w:val="28"/>
+        </w:rPr>
+        <w:t xml:space="preserve"> </w:t>
+      </w:r>
+      <w:proofErr w:type="spellStart"/>
+      <w:r>
+        <w:rPr>
+          <w:rFonts w:ascii="Times New Roman" w:hAnsi="Times New Roman"/>
+          <w:szCs w:val="28"/>
+        </w:rPr>
+        <w:t>khai</w:t>
+      </w:r>
+      <w:proofErr w:type="spellEnd"/>
+      <w:r>
+        <w:rPr>
+          <w:rFonts w:ascii="Times New Roman" w:hAnsi="Times New Roman"/>
+          <w:szCs w:val="28"/>
+        </w:rPr>
+        <w:t xml:space="preserve">, </w:t>
+      </w:r>
+      <w:proofErr w:type="spellStart"/>
+      <w:r>
+        <w:rPr>
+          <w:rFonts w:ascii="Times New Roman" w:hAnsi="Times New Roman"/>
+          <w:szCs w:val="28"/>
+        </w:rPr>
+        <w:t>nếu</w:t>
+      </w:r>
+      <w:proofErr w:type="spellEnd"/>
+      <w:r>
+        <w:rPr>
+          <w:rFonts w:ascii="Times New Roman" w:hAnsi="Times New Roman"/>
+          <w:szCs w:val="28"/>
+        </w:rPr>
+        <w:t xml:space="preserve"> </w:t>
+      </w:r>
+      <w:proofErr w:type="spellStart"/>
+      <w:r>
+        <w:rPr>
+          <w:rFonts w:ascii="Times New Roman" w:hAnsi="Times New Roman"/>
+          <w:szCs w:val="28"/>
+        </w:rPr>
+        <w:t>có</w:t>
+      </w:r>
+      <w:proofErr w:type="spellEnd"/>
+      <w:r>
+        <w:rPr>
+          <w:rFonts w:ascii="Times New Roman" w:hAnsi="Times New Roman"/>
+          <w:szCs w:val="28"/>
+        </w:rPr>
+        <w:t xml:space="preserve"> </w:t>
+      </w:r>
+      <w:proofErr w:type="spellStart"/>
+      <w:r>
+        <w:rPr>
+          <w:rFonts w:ascii="Times New Roman" w:hAnsi="Times New Roman"/>
+          <w:szCs w:val="28"/>
+        </w:rPr>
+        <w:t>vướng</w:t>
+      </w:r>
+      <w:proofErr w:type="spellEnd"/>
+      <w:r>
+        <w:rPr>
+          <w:rFonts w:ascii="Times New Roman" w:hAnsi="Times New Roman"/>
+          <w:szCs w:val="28"/>
+        </w:rPr>
+        <w:t xml:space="preserve"> </w:t>
+      </w:r>
+      <w:proofErr w:type="spellStart"/>
+      <w:r>
+        <w:rPr>
+          <w:rFonts w:ascii="Times New Roman" w:hAnsi="Times New Roman"/>
+          <w:szCs w:val="28"/>
+        </w:rPr>
+        <w:t>mắc</w:t>
+      </w:r>
+      <w:proofErr w:type="spellEnd"/>
+      <w:r>
+        <w:rPr>
+          <w:rFonts w:ascii="Times New Roman" w:hAnsi="Times New Roman"/>
+          <w:szCs w:val="28"/>
+        </w:rPr>
+        <w:t xml:space="preserve"> </w:t>
+      </w:r>
+      <w:proofErr w:type="spellStart"/>
+      <w:r>
+        <w:rPr>
+          <w:rFonts w:ascii="Times New Roman" w:hAnsi="Times New Roman"/>
+          <w:szCs w:val="28"/>
+        </w:rPr>
+        <w:t>phát</w:t>
+      </w:r>
+      <w:proofErr w:type="spellEnd"/>
+      <w:r>
+        <w:rPr>
+          <w:rFonts w:ascii="Times New Roman" w:hAnsi="Times New Roman"/>
+          <w:szCs w:val="28"/>
+        </w:rPr>
+        <w:t xml:space="preserve"> </w:t>
+      </w:r>
+      <w:proofErr w:type="spellStart"/>
+      <w:r>
+        <w:rPr>
+          <w:rFonts w:ascii="Times New Roman" w:hAnsi="Times New Roman"/>
+          <w:szCs w:val="28"/>
+        </w:rPr>
+        <w:t>sinh</w:t>
+      </w:r>
+      <w:proofErr w:type="spellEnd"/>
+      <w:r>
+        <w:rPr>
+          <w:rFonts w:ascii="Times New Roman" w:hAnsi="Times New Roman"/>
+          <w:szCs w:val="28"/>
+        </w:rPr>
+        <w:t xml:space="preserve">, </w:t>
+      </w:r>
+      <w:proofErr w:type="spellStart"/>
+      <w:r>
+        <w:rPr>
+          <w:rFonts w:ascii="Times New Roman" w:hAnsi="Times New Roman"/>
+          <w:szCs w:val="28"/>
+        </w:rPr>
+        <w:t>đề</w:t>
+      </w:r>
+      <w:proofErr w:type="spellEnd"/>
+      <w:r>
+        <w:rPr>
+          <w:rFonts w:ascii="Times New Roman" w:hAnsi="Times New Roman"/>
+          <w:szCs w:val="28"/>
+        </w:rPr>
+        <w:t xml:space="preserve"> </w:t>
+      </w:r>
+      <w:proofErr w:type="spellStart"/>
+      <w:r>
+        <w:rPr>
+          <w:rFonts w:ascii="Times New Roman" w:hAnsi="Times New Roman"/>
+          <w:szCs w:val="28"/>
+        </w:rPr>
+        <w:t>nghị</w:t>
+      </w:r>
+      <w:proofErr w:type="spellEnd"/>
+      <w:r>
+        <w:rPr>
+          <w:rFonts w:ascii="Times New Roman" w:hAnsi="Times New Roman"/>
+          <w:szCs w:val="28"/>
+        </w:rPr>
+        <w:t xml:space="preserve"> </w:t>
+      </w:r>
+      <w:proofErr w:type="spellStart"/>
+      <w:r>
+        <w:rPr>
+          <w:rFonts w:ascii="Times New Roman" w:hAnsi="Times New Roman"/>
+          <w:szCs w:val="28"/>
+        </w:rPr>
+        <w:t>liên</w:t>
+      </w:r>
+      <w:proofErr w:type="spellEnd"/>
+      <w:r>
+        <w:rPr>
+          <w:rFonts w:ascii="Times New Roman" w:hAnsi="Times New Roman"/>
+          <w:szCs w:val="28"/>
+        </w:rPr>
+        <w:t xml:space="preserve"> </w:t>
+      </w:r>
+      <w:proofErr w:type="spellStart"/>
+      <w:r>
+        <w:rPr>
+          <w:rFonts w:ascii="Times New Roman" w:hAnsi="Times New Roman"/>
+          <w:szCs w:val="28"/>
+        </w:rPr>
+        <w:t>hệ</w:t>
+      </w:r>
+      <w:proofErr w:type="spellEnd"/>
+      <w:r>
+        <w:rPr>
+          <w:rFonts w:ascii="Times New Roman" w:hAnsi="Times New Roman"/>
+          <w:szCs w:val="28"/>
+        </w:rPr>
+        <w:t xml:space="preserve"> </w:t>
+      </w:r>
+      <w:proofErr w:type="spellStart"/>
+      <w:r>
+        <w:rPr>
+          <w:rFonts w:ascii="Times New Roman" w:hAnsi="Times New Roman"/>
+          <w:szCs w:val="28"/>
+        </w:rPr>
+        <w:t>với</w:t>
+      </w:r>
+      <w:proofErr w:type="spellEnd"/>
+      <w:r>
+        <w:rPr>
+          <w:rFonts w:ascii="Times New Roman" w:hAnsi="Times New Roman"/>
+          <w:szCs w:val="28"/>
+        </w:rPr>
+        <w:t xml:space="preserve"> Ban </w:t>
+      </w:r>
+      <w:proofErr w:type="spellStart"/>
+      <w:r>
+        <w:rPr>
+          <w:rFonts w:ascii="Times New Roman" w:hAnsi="Times New Roman"/>
+          <w:szCs w:val="28"/>
+        </w:rPr>
+        <w:t>tổ</w:t>
+      </w:r>
+      <w:proofErr w:type="spellEnd"/>
+      <w:r>
+        <w:rPr>
+          <w:rFonts w:ascii="Times New Roman" w:hAnsi="Times New Roman"/>
+          <w:szCs w:val="28"/>
+        </w:rPr>
+        <w:t xml:space="preserve"> </w:t>
+      </w:r>
+      <w:proofErr w:type="spellStart"/>
+      <w:r>
+        <w:rPr>
+          <w:rFonts w:ascii="Times New Roman" w:hAnsi="Times New Roman"/>
+          <w:szCs w:val="28"/>
+        </w:rPr>
+        <w:t>chức</w:t>
+      </w:r>
+      <w:proofErr w:type="spellEnd"/>
+      <w:r>
+        <w:rPr>
+          <w:rFonts w:ascii="Times New Roman" w:hAnsi="Times New Roman"/>
+          <w:szCs w:val="28"/>
+        </w:rPr>
+        <w:t xml:space="preserve"> </w:t>
+      </w:r>
+      <w:proofErr w:type="spellStart"/>
+      <w:r>
+        <w:rPr>
+          <w:rFonts w:ascii="Times New Roman" w:hAnsi="Times New Roman"/>
+          <w:szCs w:val="28"/>
+        </w:rPr>
+        <w:t>Hội</w:t>
+      </w:r>
+      <w:proofErr w:type="spellEnd"/>
+      <w:r>
+        <w:rPr>
+          <w:rFonts w:ascii="Times New Roman" w:hAnsi="Times New Roman"/>
+          <w:szCs w:val="28"/>
+        </w:rPr>
+        <w:t xml:space="preserve"> </w:t>
+      </w:r>
+      <w:proofErr w:type="spellStart"/>
+      <w:r>
+        <w:rPr>
+          <w:rFonts w:ascii="Times New Roman" w:hAnsi="Times New Roman"/>
+          <w:szCs w:val="28"/>
+        </w:rPr>
+        <w:t>nghị</w:t>
+      </w:r>
+      <w:proofErr w:type="spellEnd"/>
+      <w:r>
+        <w:rPr>
+          <w:rFonts w:ascii="Times New Roman" w:hAnsi="Times New Roman"/>
+          <w:szCs w:val="28"/>
+        </w:rPr>
+        <w:t xml:space="preserve">, </w:t>
+      </w:r>
+      <w:proofErr w:type="spellStart"/>
+      <w:r>
+        <w:rPr>
+          <w:rFonts w:ascii="Times New Roman" w:hAnsi="Times New Roman"/>
+          <w:szCs w:val="28"/>
+        </w:rPr>
+        <w:t>số</w:t>
+      </w:r>
+      <w:proofErr w:type="spellEnd"/>
+      <w:r>
+        <w:rPr>
+          <w:rFonts w:ascii="Times New Roman" w:hAnsi="Times New Roman"/>
+          <w:szCs w:val="28"/>
+        </w:rPr>
+        <w:t xml:space="preserve"> </w:t>
+      </w:r>
+      <w:proofErr w:type="spellStart"/>
+      <w:r>
+        <w:rPr>
+          <w:rFonts w:ascii="Times New Roman" w:hAnsi="Times New Roman"/>
+          <w:szCs w:val="28"/>
+        </w:rPr>
+        <w:t>điện</w:t>
+      </w:r>
+      <w:proofErr w:type="spellEnd"/>
+      <w:r>
+        <w:rPr>
+          <w:rFonts w:ascii="Times New Roman" w:hAnsi="Times New Roman"/>
+          <w:szCs w:val="28"/>
+        </w:rPr>
+        <w:t xml:space="preserve"> </w:t>
+      </w:r>
+      <w:proofErr w:type="spellStart"/>
+      <w:proofErr w:type="gramStart"/>
+      <w:r>
+        <w:rPr>
+          <w:rFonts w:ascii="Times New Roman" w:hAnsi="Times New Roman"/>
+          <w:szCs w:val="28"/>
+        </w:rPr>
+        <w:t>thoại</w:t>
+      </w:r>
+      <w:proofErr w:type="spellEnd"/>
+      <w:r>
+        <w:rPr>
+          <w:rFonts w:ascii="Times New Roman" w:hAnsi="Times New Roman"/>
+          <w:szCs w:val="28"/>
+        </w:rPr>
+        <w:t>:…</w:t>
+      </w:r>
+      <w:proofErr w:type="gramEnd"/>
+      <w:r>
+        <w:rPr>
+          <w:rFonts w:ascii="Times New Roman" w:hAnsi="Times New Roman"/>
+          <w:szCs w:val="28"/>
+        </w:rPr>
+        <w:t>……………</w:t>
+      </w:r>
+      <w:proofErr w:type="gramStart"/>
+      <w:r>
+        <w:rPr>
+          <w:rFonts w:ascii="Times New Roman" w:hAnsi="Times New Roman"/>
+          <w:szCs w:val="28"/>
+        </w:rPr>
+        <w:t>….</w:t>
+      </w:r>
+      <w:proofErr w:type="spellStart"/>
+      <w:r>
+        <w:rPr>
+          <w:rFonts w:ascii="Times New Roman" w:hAnsi="Times New Roman"/>
+          <w:szCs w:val="28"/>
+        </w:rPr>
+        <w:t>để</w:t>
+      </w:r>
+      <w:proofErr w:type="spellEnd"/>
+      <w:proofErr w:type="gramEnd"/>
+      <w:r>
+        <w:rPr>
+          <w:rFonts w:ascii="Times New Roman" w:hAnsi="Times New Roman"/>
+          <w:szCs w:val="28"/>
+        </w:rPr>
+        <w:t xml:space="preserve"> </w:t>
+      </w:r>
+      <w:proofErr w:type="spellStart"/>
+      <w:r>
+        <w:rPr>
+          <w:rFonts w:ascii="Times New Roman" w:hAnsi="Times New Roman"/>
+          <w:szCs w:val="28"/>
+        </w:rPr>
+        <w:t>phối</w:t>
+      </w:r>
+      <w:proofErr w:type="spellEnd"/>
+      <w:r>
+        <w:rPr>
+          <w:rFonts w:ascii="Times New Roman" w:hAnsi="Times New Roman"/>
+          <w:szCs w:val="28"/>
+        </w:rPr>
+        <w:t xml:space="preserve"> </w:t>
+      </w:r>
+      <w:proofErr w:type="spellStart"/>
+      <w:r>
+        <w:rPr>
+          <w:rFonts w:ascii="Times New Roman" w:hAnsi="Times New Roman"/>
+          <w:szCs w:val="28"/>
+        </w:rPr>
+        <w:t>hợp</w:t>
+      </w:r>
+      <w:proofErr w:type="spellEnd"/>
+      <w:r>
+        <w:rPr>
+          <w:rFonts w:ascii="Times New Roman" w:hAnsi="Times New Roman"/>
+          <w:szCs w:val="28"/>
+        </w:rPr>
+        <w:t xml:space="preserve"> </w:t>
+      </w:r>
+      <w:proofErr w:type="spellStart"/>
+      <w:r>
+        <w:rPr>
+          <w:rFonts w:ascii="Times New Roman" w:hAnsi="Times New Roman"/>
+          <w:szCs w:val="28"/>
+        </w:rPr>
+        <w:t>giải</w:t>
+      </w:r>
+      <w:proofErr w:type="spellEnd"/>
+      <w:r>
+        <w:rPr>
+          <w:rFonts w:ascii="Times New Roman" w:hAnsi="Times New Roman"/>
+          <w:szCs w:val="28"/>
+        </w:rPr>
+        <w:t xml:space="preserve"> </w:t>
+      </w:r>
+      <w:proofErr w:type="spellStart"/>
+      <w:r>
+        <w:rPr>
+          <w:rFonts w:ascii="Times New Roman" w:hAnsi="Times New Roman"/>
+          <w:szCs w:val="28"/>
+        </w:rPr>
+        <w:t>quyết</w:t>
+      </w:r>
+      <w:proofErr w:type="spellEnd"/>
+      <w:r>
+        <w:rPr>
+          <w:rFonts w:ascii="Times New Roman" w:hAnsi="Times New Roman"/>
+          <w:szCs w:val="28"/>
+        </w:rPr>
+        <w:t>.</w:t>
+      </w:r>
     </w:p>
     <w:p>
       <w:pPr>

</xml_diff>